<commit_message>
Dodaj naslovnu stranicu u .docx i podrzi *italic* formatiranje
Co-Authored-By: Claude Opus 4.8 <noreply@anthropic.com>
</commit_message>
<xml_diff>
--- a/Seminar_AHP_Odabir_mobitela.docx
+++ b/Seminar_AHP_Odabir_mobitela.docx
@@ -4,10 +4,153 @@
   <w:body>
     <w:p>
       <w:pPr>
-        <w:pStyle w:val="Title"/>
+        <w:spacing w:after="0"/>
+        <w:jc w:val="center"/>
       </w:pPr>
       <w:r>
-        <w:t>Odabir optimalnog pametnog telefona primjenom AHP metode</w:t>
+        <w:rPr>
+          <w:b/>
+          <w:i w:val="0"/>
+          <w:sz w:val="28"/>
+        </w:rPr>
+        <w:t>Sveučilište u Rijeci</w:t>
+      </w:r>
+    </w:p>
+    <w:p>
+      <w:pPr>
+        <w:spacing w:after="40"/>
+        <w:jc w:val="center"/>
+      </w:pPr>
+      <w:r>
+        <w:rPr>
+          <w:b w:val="0"/>
+          <w:i w:val="0"/>
+          <w:sz w:val="24"/>
+        </w:rPr>
+        <w:t>Fakultet informatike i digitalnih tehnologija</w:t>
+      </w:r>
+    </w:p>
+    <w:p>
+      <w:pPr>
+        <w:spacing w:after="0"/>
+        <w:jc w:val="center"/>
+      </w:pPr>
+      <w:r>
+        <w:rPr>
+          <w:b w:val="0"/>
+          <w:i/>
+          <w:sz w:val="22"/>
+        </w:rPr>
+        <w:t>Digitalna transformacija</w:t>
+      </w:r>
+    </w:p>
+    <w:p/>
+    <w:p/>
+    <w:p/>
+    <w:p/>
+    <w:p/>
+    <w:p/>
+    <w:p>
+      <w:pPr>
+        <w:spacing w:after="0"/>
+        <w:jc w:val="center"/>
+      </w:pPr>
+      <w:r>
+        <w:rPr>
+          <w:b/>
+          <w:i w:val="0"/>
+          <w:sz w:val="44"/>
+        </w:rPr>
+        <w:t>ODABIR OPTIMALNOG PAMETNOG TELEFONA</w:t>
+      </w:r>
+    </w:p>
+    <w:p>
+      <w:pPr>
+        <w:spacing w:after="160"/>
+        <w:jc w:val="center"/>
+      </w:pPr>
+      <w:r>
+        <w:rPr>
+          <w:b/>
+          <w:i w:val="0"/>
+          <w:sz w:val="44"/>
+        </w:rPr>
+        <w:t>PRIMJENOM AHP METODE</w:t>
+      </w:r>
+    </w:p>
+    <w:p>
+      <w:pPr>
+        <w:spacing w:after="120"/>
+        <w:jc w:val="center"/>
+      </w:pPr>
+      <w:r>
+        <w:rPr>
+          <w:b w:val="0"/>
+          <w:i/>
+          <w:sz w:val="24"/>
+        </w:rPr>
+        <w:t>Seminarski rad iz višekriterijskog odlučivanja</w:t>
+      </w:r>
+    </w:p>
+    <w:p/>
+    <w:p/>
+    <w:p/>
+    <w:p/>
+    <w:p/>
+    <w:p/>
+    <w:p/>
+    <w:p/>
+    <w:p>
+      <w:pPr>
+        <w:spacing w:after="80"/>
+        <w:jc w:val="center"/>
+      </w:pPr>
+      <w:r>
+        <w:rPr>
+          <w:b w:val="0"/>
+          <w:i w:val="0"/>
+          <w:sz w:val="24"/>
+        </w:rPr>
+        <w:t>Studenti: _______________________________</w:t>
+      </w:r>
+    </w:p>
+    <w:p>
+      <w:pPr>
+        <w:spacing w:after="120"/>
+        <w:jc w:val="center"/>
+      </w:pPr>
+      <w:r>
+        <w:rPr>
+          <w:b w:val="0"/>
+          <w:i w:val="0"/>
+          <w:sz w:val="24"/>
+        </w:rPr>
+        <w:t>Mentor: _______________________________</w:t>
+      </w:r>
+    </w:p>
+    <w:p/>
+    <w:p/>
+    <w:p/>
+    <w:p/>
+    <w:p/>
+    <w:p/>
+    <w:p>
+      <w:pPr>
+        <w:spacing w:after="120"/>
+        <w:jc w:val="center"/>
+      </w:pPr>
+      <w:r>
+        <w:rPr>
+          <w:b w:val="0"/>
+          <w:i w:val="0"/>
+          <w:sz w:val="22"/>
+        </w:rPr>
+        <w:t>Rijeka, lipanj 2026.</w:t>
+      </w:r>
+    </w:p>
+    <w:p>
+      <w:r>
+        <w:br w:type="page"/>
       </w:r>
     </w:p>
     <w:p>
@@ -35,7 +178,19 @@
         <w:rPr>
           <w:b w:val="0"/>
         </w:rPr>
-        <w:t xml:space="preserve">. Tržište nudi velik broj uređaja koji se razlikuju po cijeni, kvaliteti kamere, performansama, kapacitetu pohrane i fizičkim karakteristikama, pri čemu poboljšanje jedne značajke najčešće povlači nagodbu (engl. *trade-off*) kod druge — jeftiniji uređaji obično imaju slabiju kameru, snažniji uređaji veću masu i cijenu, a uređaji s vrhunskom kamerom nisu nužno najbolji u pohrani ili autonomiji baterije. Donositelj odluke stoga ne može jednostavno odabrati „najbolji" telefon jer ne postoji uređaj koji je istovremeno najbolji po svim kriterijima; potrebno je </w:t>
+        <w:t xml:space="preserve">. Tržište nudi velik broj uređaja koji se razlikuju po cijeni, kvaliteti kamere, performansama, kapacitetu pohrane i fizičkim karakteristikama, pri čemu poboljšanje jedne značajke najčešće povlači nagodbu (engl. </w:t>
+      </w:r>
+      <w:r>
+        <w:rPr>
+          <w:i/>
+        </w:rPr>
+        <w:t>trade-off</w:t>
+      </w:r>
+      <w:r>
+        <w:rPr>
+          <w:b w:val="0"/>
+        </w:rPr>
+        <w:t xml:space="preserve">) kod druge — jeftiniji uređaji obično imaju slabiju kameru, snažniji uređaji veću masu i cijenu, a uređaji s vrhunskom kamerom nisu nužno najbolji u pohrani ili autonomiji baterije. Donositelj odluke stoga ne može jednostavno odabrati „najbolji" telefon jer ne postoji uređaj koji je istovremeno najbolji po svim kriterijima; potrebno je </w:t>
       </w:r>
       <w:r>
         <w:rPr>
@@ -276,7 +431,19 @@
         <w:rPr>
           <w:b w:val="0"/>
         </w:rPr>
-        <w:t xml:space="preserve"> — nabavna cijena uređaja u eurima. Kriterij je *troškovni* (manja vrijednost je poželjnija).</w:t>
+        <w:t xml:space="preserve"> — nabavna cijena uređaja u eurima. Kriterij je </w:t>
+      </w:r>
+      <w:r>
+        <w:rPr>
+          <w:i/>
+        </w:rPr>
+        <w:t>troškovni</w:t>
+      </w:r>
+      <w:r>
+        <w:rPr>
+          <w:b w:val="0"/>
+        </w:rPr>
+        <w:t xml:space="preserve"> (manja vrijednost je poželjnija).</w:t>
       </w:r>
     </w:p>
     <w:p>
@@ -293,7 +460,19 @@
         <w:rPr>
           <w:b w:val="0"/>
         </w:rPr>
-        <w:t xml:space="preserve"> — izražena rezolucijom senzora u megapikselima (MP), kao ključnom mjerljivom pokazateljem za fotografiju radova. *Korisni* kriterij (više je bolje).</w:t>
+        <w:t xml:space="preserve"> — izražena rezolucijom senzora u megapikselima (MP), kao ključnom mjerljivom pokazateljem za fotografiju radova. </w:t>
+      </w:r>
+      <w:r>
+        <w:rPr>
+          <w:i/>
+        </w:rPr>
+        <w:t>Korisni</w:t>
+      </w:r>
+      <w:r>
+        <w:rPr>
+          <w:b w:val="0"/>
+        </w:rPr>
+        <w:t xml:space="preserve"> kriterij (više je bolje).</w:t>
       </w:r>
     </w:p>
     <w:p>
@@ -412,7 +591,19 @@
         <w:rPr>
           <w:b w:val="0"/>
         </w:rPr>
-        <w:t xml:space="preserve"> — kapacitet interne memorije u gigabajtima, za pohranu velikih grafičkih i video datoteka. *Korisni* kriterij (više je bolje).</w:t>
+        <w:t xml:space="preserve"> — kapacitet interne memorije u gigabajtima, za pohranu velikih grafičkih i video datoteka. </w:t>
+      </w:r>
+      <w:r>
+        <w:rPr>
+          <w:i/>
+        </w:rPr>
+        <w:t>Korisni</w:t>
+      </w:r>
+      <w:r>
+        <w:rPr>
+          <w:b w:val="0"/>
+        </w:rPr>
+        <w:t xml:space="preserve"> kriterij (više je bolje).</w:t>
       </w:r>
     </w:p>
     <w:p>
@@ -4234,7 +4425,31 @@
         <w:rPr>
           <w:b w:val="0"/>
         </w:rPr>
-        <w:t xml:space="preserve"> Izračun je proveden u oba načina sinteze koje nudi Expert Choice — *Distributive* (normalizacija po zbroju) i *Ideal* (normalizacija po najboljoj alternativi, otpornija na pojavu obrtanja ranga):</w:t>
+        <w:t xml:space="preserve"> Izračun je proveden u oba načina sinteze koje nudi Expert Choice — </w:t>
+      </w:r>
+      <w:r>
+        <w:rPr>
+          <w:i/>
+        </w:rPr>
+        <w:t>Distributive</w:t>
+      </w:r>
+      <w:r>
+        <w:rPr>
+          <w:b w:val="0"/>
+        </w:rPr>
+        <w:t xml:space="preserve"> (normalizacija po zbroju) i </w:t>
+      </w:r>
+      <w:r>
+        <w:rPr>
+          <w:i/>
+        </w:rPr>
+        <w:t>Ideal</w:t>
+      </w:r>
+      <w:r>
+        <w:rPr>
+          <w:b w:val="0"/>
+        </w:rPr>
+        <w:t xml:space="preserve"> (normalizacija po najboljoj alternativi, otpornija na pojavu obrtanja ranga):</w:t>
       </w:r>
     </w:p>
     <w:tbl>
@@ -4726,7 +4941,19 @@
         <w:rPr>
           <w:b w:val="0"/>
         </w:rPr>
-        <w:t>, jer se isti pojam — *prioritet* — pojavljuje na svim grafovima.</w:t>
+        <w:t xml:space="preserve">, jer se isti pojam — </w:t>
+      </w:r>
+      <w:r>
+        <w:rPr>
+          <w:i/>
+        </w:rPr>
+        <w:t>prioritet</w:t>
+      </w:r>
+      <w:r>
+        <w:rPr>
+          <w:b w:val="0"/>
+        </w:rPr>
+        <w:t xml:space="preserve"> — pojavljuje na svim grafovima.</w:t>
       </w:r>
     </w:p>
     <w:p>
@@ -4743,7 +4970,19 @@
         <w:rPr>
           <w:b w:val="0"/>
         </w:rPr>
-        <w:t>, a ne apsolutna mjera. Ne mjeri se u eurima, megapikselima ni gigabajtima, nego u *udjelu važnosti* na skali od 0 do 1.</w:t>
+        <w:t xml:space="preserve">, a ne apsolutna mjera. Ne mjeri se u eurima, megapikselima ni gigabajtima, nego u </w:t>
+      </w:r>
+      <w:r>
+        <w:rPr>
+          <w:i/>
+        </w:rPr>
+        <w:t>udjelu važnosti</w:t>
+      </w:r>
+      <w:r>
+        <w:rPr>
+          <w:b w:val="0"/>
+        </w:rPr>
+        <w:t xml:space="preserve"> na skali od 0 do 1.</w:t>
       </w:r>
     </w:p>
     <w:p>
@@ -4760,7 +4999,31 @@
         <w:rPr>
           <w:b w:val="0"/>
         </w:rPr>
-        <w:t xml:space="preserve"> dobiven je „Data mode" postupkom (kako radi Expert Choice): stvarne se vrijednosti iz tablice normaliziraju. Za kriterije gdje je *više bolje* (kamera, RAM, baterija, ekran, pohrana) koristi se izravan udio: prioritet = vrijednost / zbroj svih vrijednosti. Za kriterije gdje je *manje bolje* (cijena, težina) koristi se recipročna vrijednost: prioritet = (1/vrijednost) / zbroj recipročnih vrijednosti. Zbog toga </w:t>
+        <w:t xml:space="preserve"> dobiven je „Data mode" postupkom (kako radi Expert Choice): stvarne se vrijednosti iz tablice normaliziraju. Za kriterije gdje je </w:t>
+      </w:r>
+      <w:r>
+        <w:rPr>
+          <w:i/>
+        </w:rPr>
+        <w:t>više bolje</w:t>
+      </w:r>
+      <w:r>
+        <w:rPr>
+          <w:b w:val="0"/>
+        </w:rPr>
+        <w:t xml:space="preserve"> (kamera, RAM, baterija, ekran, pohrana) koristi se izravan udio: prioritet = vrijednost / zbroj svih vrijednosti. Za kriterije gdje je </w:t>
+      </w:r>
+      <w:r>
+        <w:rPr>
+          <w:i/>
+        </w:rPr>
+        <w:t>manje bolje</w:t>
+      </w:r>
+      <w:r>
+        <w:rPr>
+          <w:b w:val="0"/>
+        </w:rPr>
+        <w:t xml:space="preserve"> (cijena, težina) koristi se recipročna vrijednost: prioritet = (1/vrijednost) / zbroj recipročnih vrijednosti. Zbog toga </w:t>
       </w:r>
       <w:r>
         <w:rPr>
@@ -4820,7 +5083,19 @@
         <w:rPr>
           <w:b w:val="0"/>
         </w:rPr>
-        <w:t xml:space="preserve"> budući da se za kameru i pohranu koristi *omjerna* normalizacija, jedna ekstremno visoka vrijednost „pojede" velik dio udjela i gurne sve ostale nisko. Honor 90 ima 200 MP, što je oko četiri puta više od ostalih (48–50 MP), pa njegov lokalni prioritet po kameri iznosi 0,446, dok svih pet uređaja s ~50 MP dobivaju tek po 0,112 (manje od ravnomjernih 1/6 = 0,167). Isto vrijedi za pohranu (512 GB naspram 128–256 GB). Ova „dominacija omjerom" glavni je pokretač rezultata i objašnjava zašto je Honorova prednost tako velika na svim grafovima.</w:t>
+        <w:t xml:space="preserve"> budući da se za kameru i pohranu koristi </w:t>
+      </w:r>
+      <w:r>
+        <w:rPr>
+          <w:i/>
+        </w:rPr>
+        <w:t>omjerna</w:t>
+      </w:r>
+      <w:r>
+        <w:rPr>
+          <w:b w:val="0"/>
+        </w:rPr>
+        <w:t xml:space="preserve"> normalizacija, jedna ekstremno visoka vrijednost „pojede" velik dio udjela i gurne sve ostale nisko. Honor 90 ima 200 MP, što je oko četiri puta više od ostalih (48–50 MP), pa njegov lokalni prioritet po kameri iznosi 0,446, dok svih pet uređaja s ~50 MP dobivaju tek po 0,112 (manje od ravnomjernih 1/6 = 0,167). Isto vrijedi za pohranu (512 GB naspram 128–256 GB). Ova „dominacija omjerom" glavni je pokretač rezultata i objašnjava zašto je Honorova prednost tako velika na svim grafovima.</w:t>
       </w:r>
     </w:p>
     <w:p>
@@ -6357,7 +6632,19 @@
         <w:rPr>
           <w:b w:val="0"/>
         </w:rPr>
-        <w:t xml:space="preserve"> mjeri koliko je svaka alternativa dobra *unutar* pojedinog kriterija. Vrijednosti su normalizirani udjeli koji unutar svakog kriterija zbrajaju u 1,0.</w:t>
+        <w:t xml:space="preserve"> mjeri koliko je svaka alternativa dobra </w:t>
+      </w:r>
+      <w:r>
+        <w:rPr>
+          <w:i/>
+        </w:rPr>
+        <w:t>unutar</w:t>
+      </w:r>
+      <w:r>
+        <w:rPr>
+          <w:b w:val="0"/>
+        </w:rPr>
+        <w:t xml:space="preserve"> pojedinog kriterija. Vrijednosti su normalizirani udjeli koji unutar svakog kriterija zbrajaju u 1,0.</w:t>
       </w:r>
     </w:p>
     <w:p>
@@ -6524,7 +6811,19 @@
         <w:rPr>
           <w:b w:val="0"/>
         </w:rPr>
-        <w:t xml:space="preserve">. Oba vrha leže iznad srednje do visoko teških stupaca, što znači da se Honorova prednost *množi velikim težinama* i prelijeva u konačni rezultat. Istodobno Honor pada na </w:t>
+        <w:t xml:space="preserve">. Oba vrha leže iznad srednje do visoko teških stupaca, što znači da se Honorova prednost </w:t>
+      </w:r>
+      <w:r>
+        <w:rPr>
+          <w:i/>
+        </w:rPr>
+        <w:t>množi velikim težinama</w:t>
+      </w:r>
+      <w:r>
+        <w:rPr>
+          <w:b w:val="0"/>
+        </w:rPr>
+        <w:t xml:space="preserve"> i prelijeva u konačni rezultat. Istodobno Honor pada na </w:t>
       </w:r>
       <w:r>
         <w:rPr>
@@ -6616,7 +6915,43 @@
         <w:rPr>
           <w:b w:val="0"/>
         </w:rPr>
-        <w:t xml:space="preserve"> pobjednika određuje poklapanje *visoke linije* s *visokim stupcem*. Samo Honor ima svoj najviši vrh točno iznad najvišeg stupca (kamera), što je sažeta vizualna „formula" njegove pobjede. Svi mjesta gdje se sve linije stišću zajedno (npr. fizičke karakteristike, gdje su svi oko 0,16–0,17) pokazuju kriterije koji *ne razlikuju* alternative i stoga ne utječu na odluku.</w:t>
+        <w:t xml:space="preserve"> pobjednika određuje poklapanje </w:t>
+      </w:r>
+      <w:r>
+        <w:rPr>
+          <w:i/>
+        </w:rPr>
+        <w:t>visoke linije</w:t>
+      </w:r>
+      <w:r>
+        <w:rPr>
+          <w:b w:val="0"/>
+        </w:rPr>
+        <w:t xml:space="preserve"> s </w:t>
+      </w:r>
+      <w:r>
+        <w:rPr>
+          <w:i/>
+        </w:rPr>
+        <w:t>visokim stupcem</w:t>
+      </w:r>
+      <w:r>
+        <w:rPr>
+          <w:b w:val="0"/>
+        </w:rPr>
+        <w:t xml:space="preserve">. Samo Honor ima svoj najviši vrh točno iznad najvišeg stupca (kamera), što je sažeta vizualna „formula" njegove pobjede. Svi mjesta gdje se sve linije stišću zajedno (npr. fizičke karakteristike, gdje su svi oko 0,16–0,17) pokazuju kriterije koji </w:t>
+      </w:r>
+      <w:r>
+        <w:rPr>
+          <w:i/>
+        </w:rPr>
+        <w:t>ne razlikuju</w:t>
+      </w:r>
+      <w:r>
+        <w:rPr>
+          <w:b w:val="0"/>
+        </w:rPr>
+        <w:t xml:space="preserve"> alternative i stoga ne utječu na odluku.</w:t>
       </w:r>
     </w:p>
     <w:p>
@@ -6731,7 +7066,19 @@
         <w:rPr>
           <w:b w:val="0"/>
         </w:rPr>
-        <w:t xml:space="preserve"> — pet vodoravnih *plavih* (steelblue) stupaca, jednake boje jer prikazuju istu veličinu (težinu). Uz svaki je ispisana vrijednost: Kvaliteta kamere 0,357 (najduži), Performanse 0,226, Pohrana 0,179, Cijena 0,156, Fizičke 0,082 (najkraći). Vodoravna os je „tezina".</w:t>
+        <w:t xml:space="preserve"> — pet vodoravnih </w:t>
+      </w:r>
+      <w:r>
+        <w:rPr>
+          <w:i/>
+        </w:rPr>
+        <w:t>plavih</w:t>
+      </w:r>
+      <w:r>
+        <w:rPr>
+          <w:b w:val="0"/>
+        </w:rPr>
+        <w:t xml:space="preserve"> (steelblue) stupaca, jednake boje jer prikazuju istu veličinu (težinu). Uz svaki je ispisana vrijednost: Kvaliteta kamere 0,357 (najduži), Performanse 0,226, Pohrana 0,179, Cijena 0,156, Fizičke 0,082 (najkraći). Vodoravna os je „tezina".</w:t>
       </w:r>
     </w:p>
     <w:p>
@@ -6748,7 +7095,19 @@
         <w:rPr>
           <w:b w:val="0"/>
         </w:rPr>
-        <w:t xml:space="preserve"> — šest vodoravnih stupaca, ovaj put *obojenih bojom svake alternative*, </w:t>
+        <w:t xml:space="preserve"> — šest vodoravnih stupaca, ovaj put </w:t>
+      </w:r>
+      <w:r>
+        <w:rPr>
+          <w:i/>
+        </w:rPr>
+        <w:t>obojenih bojom svake alternative</w:t>
+      </w:r>
+      <w:r>
+        <w:rPr>
+          <w:b w:val="0"/>
+        </w:rPr>
+        <w:t xml:space="preserve">, </w:t>
       </w:r>
       <w:r>
         <w:rPr>
@@ -7038,7 +7397,19 @@
         <w:rPr>
           <w:b w:val="0"/>
         </w:rPr>
-        <w:t xml:space="preserve"> od kojih se „sastojaka" sastoji ukupni prioritet svake alternative, tj. koliko svaki *kriterij* doprinosi konačnom rezultatu te alternative. Okomita os je „Ukupni prioritet (po komponentama)".</w:t>
+        <w:t xml:space="preserve"> od kojih se „sastojaka" sastoji ukupni prioritet svake alternative, tj. koliko svaki </w:t>
+      </w:r>
+      <w:r>
+        <w:rPr>
+          <w:i/>
+        </w:rPr>
+        <w:t>kriterij</w:t>
+      </w:r>
+      <w:r>
+        <w:rPr>
+          <w:b w:val="0"/>
+        </w:rPr>
+        <w:t xml:space="preserve"> doprinosi konačnom rezultatu te alternative. Okomita os je „Ukupni prioritet (po komponentama)".</w:t>
       </w:r>
     </w:p>
     <w:p>
@@ -7195,7 +7566,31 @@
         <w:rPr>
           <w:b w:val="0"/>
         </w:rPr>
-        <w:t>; ta dva segmenta zajedno čine ~⅔ njegove ukupne vrijednosti. Time je vizualno dokazano da Honorova pobjeda *gotovo u cijelosti počiva na dva kriterija*. Kod OnePlusa je najuočljiviji zeleni segment (performanse), kod oba Samsunga tirkizni (cijena), a iPhone ima najniži stupac s ujednačeno malim segmentima — nema niti jednog kriterija na kojem se ističe. Components graf tako objašnjava *uzrok* poretka koji desni panel base-grafa prikazuje samo kao rezultat.</w:t>
+        <w:t xml:space="preserve">; ta dva segmenta zajedno čine ~⅔ njegove ukupne vrijednosti. Time je vizualno dokazano da Honorova pobjeda </w:t>
+      </w:r>
+      <w:r>
+        <w:rPr>
+          <w:i/>
+        </w:rPr>
+        <w:t>gotovo u cijelosti počiva na dva kriterija</w:t>
+      </w:r>
+      <w:r>
+        <w:rPr>
+          <w:b w:val="0"/>
+        </w:rPr>
+        <w:t xml:space="preserve">. Kod OnePlusa je najuočljiviji zeleni segment (performanse), kod oba Samsunga tirkizni (cijena), a iPhone ima najniži stupac s ujednačeno malim segmentima — nema niti jednog kriterija na kojem se ističe. Components graf tako objašnjava </w:t>
+      </w:r>
+      <w:r>
+        <w:rPr>
+          <w:i/>
+        </w:rPr>
+        <w:t>uzrok</w:t>
+      </w:r>
+      <w:r>
+        <w:rPr>
+          <w:b w:val="0"/>
+        </w:rPr>
+        <w:t xml:space="preserve"> poretka koji desni panel base-grafa prikazuje samo kao rezultat.</w:t>
       </w:r>
     </w:p>
     <w:p>
@@ -7283,7 +7678,19 @@
         <w:rPr>
           <w:b w:val="0"/>
         </w:rPr>
-        <w:t xml:space="preserve"> ispituje što bi se dogodilo s poretkom kad bi se *samo težina tog kriterija* mijenjala kroz cijeli raspon od 0 do 1 (ostale težine se proporcionalno skaliraju). Graf čini </w:t>
+        <w:t xml:space="preserve"> ispituje što bi se dogodilo s poretkom kad bi se </w:t>
+      </w:r>
+      <w:r>
+        <w:rPr>
+          <w:i/>
+        </w:rPr>
+        <w:t>samo težina tog kriterija</w:t>
+      </w:r>
+      <w:r>
+        <w:rPr>
+          <w:b w:val="0"/>
+        </w:rPr>
+        <w:t xml:space="preserve"> mijenjala kroz cijeli raspon od 0 do 1 (ostale težine se proporcionalno skaliraju). Graf čini </w:t>
       </w:r>
       <w:r>
         <w:rPr>
@@ -7631,7 +8038,43 @@
         <w:rPr>
           <w:b w:val="0"/>
         </w:rPr>
-        <w:t>. Za svaki kriterij računa se *težinski doprinos razlike*: globalna težina lista × (lokalni prioritet Honora − lokalni prioritet A35). Tako se vidi ne samo *tko je bolji* na svakom kriteriju, nego i *koliko to vrijedi* u konačnoj odluci.</w:t>
+        <w:t xml:space="preserve">. Za svaki kriterij računa se </w:t>
+      </w:r>
+      <w:r>
+        <w:rPr>
+          <w:i/>
+        </w:rPr>
+        <w:t>težinski doprinos razlike</w:t>
+      </w:r>
+      <w:r>
+        <w:rPr>
+          <w:b w:val="0"/>
+        </w:rPr>
+        <w:t xml:space="preserve">: globalna težina lista × (lokalni prioritet Honora − lokalni prioritet A35). Tako se vidi ne samo </w:t>
+      </w:r>
+      <w:r>
+        <w:rPr>
+          <w:i/>
+        </w:rPr>
+        <w:t>tko je bolji</w:t>
+      </w:r>
+      <w:r>
+        <w:rPr>
+          <w:b w:val="0"/>
+        </w:rPr>
+        <w:t xml:space="preserve"> na svakom kriteriju, nego i </w:t>
+      </w:r>
+      <w:r>
+        <w:rPr>
+          <w:i/>
+        </w:rPr>
+        <w:t>koliko to vrijedi</w:t>
+      </w:r>
+      <w:r>
+        <w:rPr>
+          <w:b w:val="0"/>
+        </w:rPr>
+        <w:t xml:space="preserve"> u konačnoj odluci.</w:t>
       </w:r>
     </w:p>
     <w:p>
@@ -8037,7 +8480,19 @@
         <w:rPr>
           <w:b w:val="0"/>
         </w:rPr>
-        <w:t xml:space="preserve"> (okomita na x ≈ 0,167, vodoravna na y ≈ 0,167) postavljene su na *prosječne* vrijednosti i dijele ravninu na </w:t>
+        <w:t xml:space="preserve"> (okomita na x ≈ 0,167, vodoravna na y ≈ 0,167) postavljene su na </w:t>
+      </w:r>
+      <w:r>
+        <w:rPr>
+          <w:i/>
+        </w:rPr>
+        <w:t>prosječne</w:t>
+      </w:r>
+      <w:r>
+        <w:rPr>
+          <w:b w:val="0"/>
+        </w:rPr>
+        <w:t xml:space="preserve"> vrijednosti i dijele ravninu na </w:t>
       </w:r>
       <w:r>
         <w:rPr>
@@ -8066,7 +8521,19 @@
         <w:rPr>
           <w:b w:val="0"/>
         </w:rPr>
-        <w:t xml:space="preserve"> — u njega pada alternativa iznadprosječna *na oba* kriterija.</w:t>
+        <w:t xml:space="preserve"> — u njega pada alternativa iznadprosječna </w:t>
+      </w:r>
+      <w:r>
+        <w:rPr>
+          <w:i/>
+        </w:rPr>
+        <w:t>na oba</w:t>
+      </w:r>
+      <w:r>
+        <w:rPr>
+          <w:b w:val="0"/>
+        </w:rPr>
+        <w:t xml:space="preserve"> kriterija.</w:t>
       </w:r>
     </w:p>
     <w:p>
@@ -8163,7 +8630,19 @@
         <w:rPr>
           <w:b w:val="0"/>
         </w:rPr>
-        <w:t xml:space="preserve"> Honorov položaj krajnje desno odgovara njegovu vrhu na Performance grafu, velikom zelenom stupcu kamere na Head-to-head grafu i golemom losos-segmentu na Components grafu. Činjenica da je *jedini* u zelenom kvadrantu vizualno sažima cijelu analizu: Honor je nadmoćan upravo na kombinaciji dvaju najvažnijih kriterija.</w:t>
+        <w:t xml:space="preserve"> Honorov položaj krajnje desno odgovara njegovu vrhu na Performance grafu, velikom zelenom stupcu kamere na Head-to-head grafu i golemom losos-segmentu na Components grafu. Činjenica da je </w:t>
+      </w:r>
+      <w:r>
+        <w:rPr>
+          <w:i/>
+        </w:rPr>
+        <w:t>jedini</w:t>
+      </w:r>
+      <w:r>
+        <w:rPr>
+          <w:b w:val="0"/>
+        </w:rPr>
+        <w:t xml:space="preserve"> u zelenom kvadrantu vizualno sažima cijelu analizu: Honor je nadmoćan upravo na kombinaciji dvaju najvažnijih kriterija.</w:t>
       </w:r>
     </w:p>
     <w:p>
@@ -8283,7 +8762,19 @@
         <w:rPr>
           <w:b w:val="0"/>
         </w:rPr>
-        <w:t xml:space="preserve"> u modelu je borba za *drugo* mjesto između Samsunga A35 i OnePlusa 11 (razlika 0,0003), koja se lako preokreće, ali ne utječe na preporuku.</w:t>
+        <w:t xml:space="preserve"> u modelu je borba za </w:t>
+      </w:r>
+      <w:r>
+        <w:rPr>
+          <w:i/>
+        </w:rPr>
+        <w:t>drugo</w:t>
+      </w:r>
+      <w:r>
+        <w:rPr>
+          <w:b w:val="0"/>
+        </w:rPr>
+        <w:t xml:space="preserve"> mjesto između Samsunga A35 i OnePlusa 11 (razlika 0,0003), koja se lako preokreće, ali ne utječe na preporuku.</w:t>
       </w:r>
     </w:p>
     <w:p>
@@ -8419,7 +8910,19 @@
         <w:rPr>
           <w:b w:val="0"/>
         </w:rPr>
-        <w:t>Saaty, T. L. (1980). *The Analytic Hierarchy Process: Planning, Priority Setting, Resource Allocation*. McGraw-Hill.</w:t>
+        <w:t xml:space="preserve">Saaty, T. L. (1980). </w:t>
+      </w:r>
+      <w:r>
+        <w:rPr>
+          <w:i/>
+        </w:rPr>
+        <w:t>The Analytic Hierarchy Process: Planning, Priority Setting, Resource Allocation</w:t>
+      </w:r>
+      <w:r>
+        <w:rPr>
+          <w:b w:val="0"/>
+        </w:rPr>
+        <w:t>. McGraw-Hill.</w:t>
       </w:r>
     </w:p>
     <w:p>
@@ -8427,7 +8930,19 @@
         <w:rPr>
           <w:b w:val="0"/>
         </w:rPr>
-        <w:t>Saaty, T. L. (1990). How to make a decision: The Analytic Hierarchy Process. *European Journal of Operational Research, 48*(1), 9–26. https://doi.org/10.1016/0377-2217(90)90057-I</w:t>
+        <w:t xml:space="preserve">Saaty, T. L. (1990). How to make a decision: The Analytic Hierarchy Process. </w:t>
+      </w:r>
+      <w:r>
+        <w:rPr>
+          <w:i/>
+        </w:rPr>
+        <w:t>European Journal of Operational Research, 48</w:t>
+      </w:r>
+      <w:r>
+        <w:rPr>
+          <w:b w:val="0"/>
+        </w:rPr>
+        <w:t>(1), 9–26. https://doi.org/10.1016/0377-2217(90)90057-I</w:t>
       </w:r>
     </w:p>
     <w:p>
@@ -8435,7 +8950,19 @@
         <w:rPr>
           <w:b w:val="0"/>
         </w:rPr>
-        <w:t>Saaty, T. L. (2008). Decision making with the Analytic Hierarchy Process. *International Journal of Services Sciences, 1*(1), 83–98. https://doi.org/10.1504/IJSSCI.2008.017590</w:t>
+        <w:t xml:space="preserve">Saaty, T. L. (2008). Decision making with the Analytic Hierarchy Process. </w:t>
+      </w:r>
+      <w:r>
+        <w:rPr>
+          <w:i/>
+        </w:rPr>
+        <w:t>International Journal of Services Sciences, 1</w:t>
+      </w:r>
+      <w:r>
+        <w:rPr>
+          <w:b w:val="0"/>
+        </w:rPr>
+        <w:t>(1), 83–98. https://doi.org/10.1504/IJSSCI.2008.017590</w:t>
       </w:r>
     </w:p>
     <w:p>
@@ -8443,7 +8970,19 @@
         <w:rPr>
           <w:b w:val="0"/>
         </w:rPr>
-        <w:t>Saaty, T. L., &amp; Vargas, L. G. (2012). *Models, Methods, Concepts &amp; Applications of the Analytic Hierarchy Process* (2. izd.). Springer.</w:t>
+        <w:t xml:space="preserve">Saaty, T. L., &amp; Vargas, L. G. (2012). </w:t>
+      </w:r>
+      <w:r>
+        <w:rPr>
+          <w:i/>
+        </w:rPr>
+        <w:t>Models, Methods, Concepts &amp; Applications of the Analytic Hierarchy Process</w:t>
+      </w:r>
+      <w:r>
+        <w:rPr>
+          <w:b w:val="0"/>
+        </w:rPr>
+        <w:t xml:space="preserve"> (2. izd.). Springer.</w:t>
       </w:r>
     </w:p>
     <w:p>
@@ -8451,7 +8990,19 @@
         <w:rPr>
           <w:b w:val="0"/>
         </w:rPr>
-        <w:t>Expert Choice Inc. (2024). *Expert Choice: Comparion software for decision making*. https://www.expertchoice.com</w:t>
+        <w:t xml:space="preserve">Expert Choice Inc. (2024). </w:t>
+      </w:r>
+      <w:r>
+        <w:rPr>
+          <w:i/>
+        </w:rPr>
+        <w:t>Expert Choice: Comparion software for decision making</w:t>
+      </w:r>
+      <w:r>
+        <w:rPr>
+          <w:b w:val="0"/>
+        </w:rPr>
+        <w:t>. https://www.expertchoice.com</w:t>
       </w:r>
     </w:p>
     <w:p>
@@ -8459,7 +9010,19 @@
         <w:rPr>
           <w:b w:val="0"/>
         </w:rPr>
-        <w:t>Amazon.com. (2026). *Honor 90 i Samsung Galaxy A56 — specifikacije i cijene*. Preuzeto 2026. s https://www.amazon.com</w:t>
+        <w:t xml:space="preserve">Amazon.com. (2026). </w:t>
+      </w:r>
+      <w:r>
+        <w:rPr>
+          <w:i/>
+        </w:rPr>
+        <w:t>Honor 90 i Samsung Galaxy A56 — specifikacije i cijene</w:t>
+      </w:r>
+      <w:r>
+        <w:rPr>
+          <w:b w:val="0"/>
+        </w:rPr>
+        <w:t>. Preuzeto 2026. s https://www.amazon.com</w:t>
       </w:r>
     </w:p>
     <w:p>
@@ -8467,7 +9030,19 @@
         <w:rPr>
           <w:b w:val="0"/>
         </w:rPr>
-        <w:t>TechnoStore.hr. (2026). *iPhone 16 — specifikacije i cijena*. Preuzeto 2026.</w:t>
+        <w:t xml:space="preserve">TechnoStore.hr. (2026). </w:t>
+      </w:r>
+      <w:r>
+        <w:rPr>
+          <w:i/>
+        </w:rPr>
+        <w:t>iPhone 16 — specifikacije i cijena</w:t>
+      </w:r>
+      <w:r>
+        <w:rPr>
+          <w:b w:val="0"/>
+        </w:rPr>
+        <w:t>. Preuzeto 2026.</w:t>
       </w:r>
     </w:p>
     <w:p>
@@ -8475,7 +9050,19 @@
         <w:rPr>
           <w:b w:val="0"/>
         </w:rPr>
-        <w:t>Masquerade.hr. (2026). *OnePlus 11 — specifikacije i cijena*. Preuzeto 2026.</w:t>
+        <w:t xml:space="preserve">Masquerade.hr. (2026). </w:t>
+      </w:r>
+      <w:r>
+        <w:rPr>
+          <w:i/>
+        </w:rPr>
+        <w:t>OnePlus 11 — specifikacije i cijena</w:t>
+      </w:r>
+      <w:r>
+        <w:rPr>
+          <w:b w:val="0"/>
+        </w:rPr>
+        <w:t>. Preuzeto 2026.</w:t>
       </w:r>
     </w:p>
     <w:p>
@@ -8483,7 +9070,19 @@
         <w:rPr>
           <w:b w:val="0"/>
         </w:rPr>
-        <w:t>NeutrinoMobile.hr. (2026). *Google Pixel 8 — specifikacije i cijena*. Preuzeto 2026.</w:t>
+        <w:t xml:space="preserve">NeutrinoMobile.hr. (2026). </w:t>
+      </w:r>
+      <w:r>
+        <w:rPr>
+          <w:i/>
+        </w:rPr>
+        <w:t>Google Pixel 8 — specifikacije i cijena</w:t>
+      </w:r>
+      <w:r>
+        <w:rPr>
+          <w:b w:val="0"/>
+        </w:rPr>
+        <w:t>. Preuzeto 2026.</w:t>
       </w:r>
     </w:p>
     <w:sectPr>

</xml_diff>

<commit_message>
Numerirane slike (Slika 1-8) s referencama u tekstu, dijagram hijerarhije, naslovnica po MoveUs spranci, objasnjenje izbora vlastite implementacije
Co-Authored-By: Claude Opus 4.8 <noreply@anthropic.com>
</commit_message>
<xml_diff>
--- a/Seminar_AHP_Odabir_mobitela.docx
+++ b/Seminar_AHP_Odabir_mobitela.docx
@@ -11,23 +11,9 @@
         <w:rPr>
           <w:b/>
           <w:i w:val="0"/>
-          <w:sz w:val="28"/>
+          <w:sz w:val="26"/>
         </w:rPr>
         <w:t>Sveučilište u Rijeci</w:t>
-      </w:r>
-    </w:p>
-    <w:p>
-      <w:pPr>
-        <w:spacing w:after="40"/>
-        <w:jc w:val="center"/>
-      </w:pPr>
-      <w:r>
-        <w:rPr>
-          <w:b w:val="0"/>
-          <w:i w:val="0"/>
-          <w:sz w:val="24"/>
-        </w:rPr>
-        <w:t>Fakultet informatike i digitalnih tehnologija</w:t>
       </w:r>
     </w:p>
     <w:p>
@@ -38,10 +24,101 @@
       <w:r>
         <w:rPr>
           <w:b w:val="0"/>
+          <w:i w:val="0"/>
+          <w:sz w:val="24"/>
+        </w:rPr>
+        <w:t>Fakultet informatike i digitalnih tehnologija</w:t>
+      </w:r>
+    </w:p>
+    <w:p>
+      <w:pPr>
+        <w:spacing w:after="120"/>
+        <w:jc w:val="center"/>
+      </w:pPr>
+      <w:r>
+        <w:rPr>
+          <w:b w:val="0"/>
           <w:i/>
           <w:sz w:val="22"/>
         </w:rPr>
-        <w:t>Digitalna transformacija</w:t>
+        <w:t>Sveučilišni diplomski studij Informatika</w:t>
+      </w:r>
+    </w:p>
+    <w:p/>
+    <w:p/>
+    <w:p/>
+    <w:p/>
+    <w:p>
+      <w:pPr>
+        <w:spacing w:after="120"/>
+        <w:jc w:val="center"/>
+      </w:pPr>
+      <w:r>
+        <w:rPr>
+          <w:b/>
+          <w:i w:val="0"/>
+          <w:sz w:val="28"/>
+        </w:rPr>
+        <w:t>Reo Turčinović</w:t>
+      </w:r>
+    </w:p>
+    <w:p/>
+    <w:p/>
+    <w:p/>
+    <w:p>
+      <w:pPr>
+        <w:spacing w:after="0"/>
+        <w:jc w:val="center"/>
+      </w:pPr>
+      <w:r>
+        <w:rPr>
+          <w:b/>
+          <w:i w:val="0"/>
+          <w:sz w:val="44"/>
+        </w:rPr>
+        <w:t>ODABIR OPTIMALNOG PAMETNOG TELEFONA</w:t>
+      </w:r>
+    </w:p>
+    <w:p>
+      <w:pPr>
+        <w:spacing w:after="160"/>
+        <w:jc w:val="center"/>
+      </w:pPr>
+      <w:r>
+        <w:rPr>
+          <w:b/>
+          <w:i w:val="0"/>
+          <w:sz w:val="44"/>
+        </w:rPr>
+        <w:t>PRIMJENOM AHP METODE</w:t>
+      </w:r>
+    </w:p>
+    <w:p>
+      <w:pPr>
+        <w:spacing w:after="0"/>
+        <w:jc w:val="center"/>
+      </w:pPr>
+      <w:r>
+        <w:rPr>
+          <w:b w:val="0"/>
+          <w:i/>
+          <w:sz w:val="24"/>
+        </w:rPr>
+        <w:t>Seminarski rad</w:t>
+      </w:r>
+    </w:p>
+    <w:p>
+      <w:pPr>
+        <w:spacing w:after="120"/>
+        <w:jc w:val="center"/>
+      </w:pPr>
+      <w:r>
+        <w:rPr>
+          <w:b w:val="0"/>
+          <w:i w:val="0"/>
+          <w:sz w:val="22"/>
+        </w:rPr>
+        <w:t>Kolegij: Upravljanje digitalnom transformacijom</w:t>
       </w:r>
     </w:p>
     <w:p/>
@@ -57,25 +134,25 @@
       </w:pPr>
       <w:r>
         <w:rPr>
-          <w:b/>
+          <w:b w:val="0"/>
           <w:i w:val="0"/>
-          <w:sz w:val="44"/>
-        </w:rPr>
-        <w:t>ODABIR OPTIMALNOG PAMETNOG TELEFONA</w:t>
+          <w:sz w:val="22"/>
+        </w:rPr>
+        <w:t>Mentori:</w:t>
       </w:r>
     </w:p>
     <w:p>
       <w:pPr>
-        <w:spacing w:after="160"/>
+        <w:spacing w:after="0"/>
         <w:jc w:val="center"/>
       </w:pPr>
       <w:r>
         <w:rPr>
-          <w:b/>
+          <w:b w:val="0"/>
           <w:i w:val="0"/>
-          <w:sz w:val="44"/>
-        </w:rPr>
-        <w:t>PRIMJENOM AHP METODE</w:t>
+          <w:sz w:val="22"/>
+        </w:rPr>
+        <w:t>prof. dr. sc. Patrizia Poščić</w:t>
       </w:r>
     </w:p>
     <w:p>
@@ -86,50 +163,12 @@
       <w:r>
         <w:rPr>
           <w:b w:val="0"/>
-          <w:i/>
-          <w:sz w:val="24"/>
-        </w:rPr>
-        <w:t>Seminarski rad iz višekriterijskog odlučivanja</w:t>
+          <w:i w:val="0"/>
+          <w:sz w:val="22"/>
+        </w:rPr>
+        <w:t>doc. dr. sc. Kristian Stančin</w:t>
       </w:r>
     </w:p>
-    <w:p/>
-    <w:p/>
-    <w:p/>
-    <w:p/>
-    <w:p/>
-    <w:p/>
-    <w:p/>
-    <w:p/>
-    <w:p>
-      <w:pPr>
-        <w:spacing w:after="80"/>
-        <w:jc w:val="center"/>
-      </w:pPr>
-      <w:r>
-        <w:rPr>
-          <w:b w:val="0"/>
-          <w:i w:val="0"/>
-          <w:sz w:val="24"/>
-        </w:rPr>
-        <w:t>Studenti: _______________________________</w:t>
-      </w:r>
-    </w:p>
-    <w:p>
-      <w:pPr>
-        <w:spacing w:after="120"/>
-        <w:jc w:val="center"/>
-      </w:pPr>
-      <w:r>
-        <w:rPr>
-          <w:b w:val="0"/>
-          <w:i w:val="0"/>
-          <w:sz w:val="24"/>
-        </w:rPr>
-        <w:t>Mentor: _______________________________</w:t>
-      </w:r>
-    </w:p>
-    <w:p/>
-    <w:p/>
     <w:p/>
     <w:p/>
     <w:p/>
@@ -259,6 +298,14 @@
           <w:b w:val="0"/>
         </w:rPr>
         <w:t xml:space="preserve"> kriterija u jedinstven, transparentan i provjerljiv model.</w:t>
+      </w:r>
+    </w:p>
+    <w:p>
+      <w:r>
+        <w:rPr>
+          <w:b w:val="0"/>
+        </w:rPr>
+        <w:t>Za provedbu AHP metode uobičajeno se koristi specijalizirani programski alat Expert Choice. Tijekom izrade ovog rada Expert Choice je, međutim, stvarao poteškoće u radu (pri unosu modela i provođenju analiza), pa je donesena odluka da se cijela metoda implementira samostalno, u programskom jeziku Python. Budući da su problem odlučivanja i sama AHP metoda dovoljno dobro shvaćeni, vlastita je implementacija ocijenjena kao pouzdaniji put do rezultata: ona omogućuje potpunu kontrolu nad izračunom lokalnih i globalnih prioriteta, provjerom konzistentnosti te nad svim analizama osjetljivosti, uz potpunu transparentnost i ponovljivost. Svi izračuni, težine i grafovi prikazani u ovom radu generirani su tom vlastitom implementacijom AHP metode.</w:t>
       </w:r>
     </w:p>
     <w:p>
@@ -1601,140 +1648,130 @@
     <w:p>
       <w:r>
         <w:rPr>
-          <w:rFonts w:ascii="Consolas" w:hAnsi="Consolas"/>
-          <w:sz w:val="17"/>
-        </w:rPr>
-        <w:t xml:space="preserve">                          CILJ: Optimalni pametni telefon za Ivanu</w:t>
-      </w:r>
-      <w:r>
-        <w:br/>
-      </w:r>
-      <w:r>
-        <w:rPr>
-          <w:rFonts w:ascii="Consolas" w:hAnsi="Consolas"/>
-          <w:sz w:val="17"/>
-        </w:rPr>
-        <w:t xml:space="preserve">                                          │</w:t>
-      </w:r>
-      <w:r>
-        <w:br/>
-      </w:r>
-      <w:r>
-        <w:rPr>
-          <w:rFonts w:ascii="Consolas" w:hAnsi="Consolas"/>
-          <w:sz w:val="17"/>
-        </w:rPr>
-        <w:t xml:space="preserve">        ┌──────────────┬──────────────────┼───────────────────┬──────────────┐</w:t>
-      </w:r>
-      <w:r>
-        <w:br/>
-      </w:r>
-      <w:r>
-        <w:rPr>
-          <w:rFonts w:ascii="Consolas" w:hAnsi="Consolas"/>
-          <w:sz w:val="17"/>
-        </w:rPr>
-        <w:t xml:space="preserve">        │              │                  │                   │              │</w:t>
-      </w:r>
-      <w:r>
-        <w:br/>
-      </w:r>
-      <w:r>
-        <w:rPr>
-          <w:rFonts w:ascii="Consolas" w:hAnsi="Consolas"/>
-          <w:sz w:val="17"/>
-        </w:rPr>
-        <w:t xml:space="preserve">     Cijena      Kvaliteta kamere     Performanse      Fizičke karakt.    Pohrana</w:t>
-      </w:r>
-      <w:r>
-        <w:br/>
-      </w:r>
-      <w:r>
-        <w:rPr>
-          <w:rFonts w:ascii="Consolas" w:hAnsi="Consolas"/>
-          <w:sz w:val="17"/>
-        </w:rPr>
-        <w:t xml:space="preserve">     (EUR,        (MP, korisni)           │                   │          podataka</w:t>
-      </w:r>
-      <w:r>
-        <w:br/>
-      </w:r>
-      <w:r>
-        <w:rPr>
-          <w:rFonts w:ascii="Consolas" w:hAnsi="Consolas"/>
-          <w:sz w:val="17"/>
-        </w:rPr>
-        <w:t xml:space="preserve">     troškovni)                    ┌──────┴──────┐      ┌─────┴─────┐    (GB, korisni)</w:t>
-      </w:r>
-      <w:r>
-        <w:br/>
-      </w:r>
-      <w:r>
-        <w:rPr>
-          <w:rFonts w:ascii="Consolas" w:hAnsi="Consolas"/>
-          <w:sz w:val="17"/>
-        </w:rPr>
-        <w:t xml:space="preserve">                                   RAM        Baterija  Ekran    Težina</w:t>
-      </w:r>
-      <w:r>
-        <w:br/>
-      </w:r>
-      <w:r>
-        <w:rPr>
-          <w:rFonts w:ascii="Consolas" w:hAnsi="Consolas"/>
-          <w:sz w:val="17"/>
-        </w:rPr>
-        <w:t xml:space="preserve">                                  (GB)         (mAh)    (inč)     (g)</w:t>
-      </w:r>
-      <w:r>
-        <w:br/>
-      </w:r>
-      <w:r>
-        <w:rPr>
-          <w:rFonts w:ascii="Consolas" w:hAnsi="Consolas"/>
-          <w:sz w:val="17"/>
-        </w:rPr>
-        <w:t xml:space="preserve">                                                          </w:t>
-      </w:r>
-      <w:r>
-        <w:br/>
-      </w:r>
-      <w:r>
-        <w:rPr>
-          <w:rFonts w:ascii="Consolas" w:hAnsi="Consolas"/>
-          <w:sz w:val="17"/>
-        </w:rPr>
-        <w:t xml:space="preserve">        └──────────────┴──────────────────┴───────────────────┴──────────────┘</w:t>
-      </w:r>
-      <w:r>
-        <w:br/>
-      </w:r>
-      <w:r>
-        <w:rPr>
-          <w:rFonts w:ascii="Consolas" w:hAnsi="Consolas"/>
-          <w:sz w:val="17"/>
-        </w:rPr>
-        <w:t xml:space="preserve">                                          │</w:t>
-      </w:r>
-      <w:r>
-        <w:br/>
-      </w:r>
-      <w:r>
-        <w:rPr>
-          <w:rFonts w:ascii="Consolas" w:hAnsi="Consolas"/>
-          <w:sz w:val="17"/>
-        </w:rPr>
-        <w:t xml:space="preserve">              Alternative: Honor 90 · iPhone 16 · Samsung Galaxy A56 ·</w:t>
-      </w:r>
-      <w:r>
-        <w:br/>
-      </w:r>
-      <w:r>
-        <w:rPr>
-          <w:rFonts w:ascii="Consolas" w:hAnsi="Consolas"/>
-          <w:sz w:val="17"/>
-        </w:rPr>
-        <w:t xml:space="preserve">                  Samsung Galaxy A35 · OnePlus 11 · Google Pixel 8</w:t>
+          <w:b w:val="0"/>
+        </w:rPr>
+        <w:t xml:space="preserve">Na </w:t>
+      </w:r>
+      <w:r>
+        <w:rPr>
+          <w:b/>
+        </w:rPr>
+        <w:t>slici 1</w:t>
+      </w:r>
+      <w:r>
+        <w:rPr>
+          <w:b w:val="0"/>
+        </w:rPr>
+        <w:t xml:space="preserve"> prikazan je cjeloviti hijerarhijski model ovog problema odlučivanja.</w:t>
+      </w:r>
+    </w:p>
+    <w:p>
+      <w:pPr>
+        <w:jc w:val="center"/>
+      </w:pPr>
+      <w:r>
+        <w:drawing>
+          <wp:inline xmlns:a="http://schemas.openxmlformats.org/drawingml/2006/main" xmlns:pic="http://schemas.openxmlformats.org/drawingml/2006/picture">
+            <wp:extent cx="5669280" cy="3622394"/>
+            <wp:docPr id="1" name="Picture 1"/>
+            <wp:cNvGraphicFramePr>
+              <a:graphicFrameLocks noChangeAspect="1"/>
+            </wp:cNvGraphicFramePr>
+            <a:graphic>
+              <a:graphicData uri="http://schemas.openxmlformats.org/drawingml/2006/picture">
+                <pic:pic>
+                  <pic:nvPicPr>
+                    <pic:cNvPr id="0" name="0_hijerarhija.png"/>
+                    <pic:cNvPicPr/>
+                  </pic:nvPicPr>
+                  <pic:blipFill>
+                    <a:blip r:embed="rId9"/>
+                    <a:stretch>
+                      <a:fillRect/>
+                    </a:stretch>
+                  </pic:blipFill>
+                  <pic:spPr>
+                    <a:xfrm>
+                      <a:off x="0" y="0"/>
+                      <a:ext cx="5669280" cy="3622394"/>
+                    </a:xfrm>
+                    <a:prstGeom prst="rect"/>
+                  </pic:spPr>
+                </pic:pic>
+              </a:graphicData>
+            </a:graphic>
+          </wp:inline>
+        </w:drawing>
+      </w:r>
+    </w:p>
+    <w:p>
+      <w:pPr>
+        <w:pStyle w:val="Caption"/>
+        <w:jc w:val="center"/>
+      </w:pPr>
+      <w:r>
+        <w:rPr>
+          <w:i/>
+          <w:color w:val="404040"/>
+          <w:sz w:val="18"/>
+        </w:rPr>
+        <w:t>Slika 1. Hijerarhijski model problema odlučivanja (cilj → kriteriji → podkriteriji → alternative)</w:t>
+      </w:r>
+    </w:p>
+    <w:p>
+      <w:r>
+        <w:rPr>
+          <w:b w:val="0"/>
+        </w:rPr>
+        <w:t xml:space="preserve">Hijerarhijski model (Slika 1) sastoji se od četiri razine povezane linijama koje prikazuju odnos nadređenosti između elemenata. Na vrhu se, u tamnoplavom pravokutniku, nalazi </w:t>
+      </w:r>
+      <w:r>
+        <w:rPr>
+          <w:b/>
+        </w:rPr>
+        <w:t>cilj</w:t>
+      </w:r>
+      <w:r>
+        <w:rPr>
+          <w:b w:val="0"/>
+        </w:rPr>
+        <w:t xml:space="preserve"> — odabir optimalnog pametnog telefona za Ivanu. Iz cilja se granaju </w:t>
+      </w:r>
+      <w:r>
+        <w:rPr>
+          <w:b/>
+        </w:rPr>
+        <w:t>pet glavnih kriterija</w:t>
+      </w:r>
+      <w:r>
+        <w:rPr>
+          <w:b w:val="0"/>
+        </w:rPr>
+        <w:t xml:space="preserve"> (svijetloplavi pravokutnici druge razine): Cijena, Kvaliteta kamere, Performanse, Fizičke karakteristike i Pohrana podataka. Dva od tih kriterija dodatno se razlažu na </w:t>
+      </w:r>
+      <w:r>
+        <w:rPr>
+          <w:b/>
+        </w:rPr>
+        <w:t>podkriterije</w:t>
+      </w:r>
+      <w:r>
+        <w:rPr>
+          <w:b w:val="0"/>
+        </w:rPr>
+        <w:t xml:space="preserve"> (treća, najsvjetlija razina): Performanse na RAM i Bateriju, a Fizičke karakteristike na Ekran i Težinu; preostala tri kriterija (Cijena, Kvaliteta kamere, Pohrana) nemaju podkriterije pa su ujedno i listovi. Na dnu (sivi pravokutnik) nalazi se </w:t>
+      </w:r>
+      <w:r>
+        <w:rPr>
+          <w:b/>
+        </w:rPr>
+        <w:t>šest alternativa</w:t>
+      </w:r>
+      <w:r>
+        <w:rPr>
+          <w:b w:val="0"/>
+        </w:rPr>
+        <w:t xml:space="preserve"> — Honor 90, iPhone 16, Samsung Galaxy A56, Samsung Galaxy A35, OnePlus 11 i Google Pixel 8 — koje su linijama povezane sa svih sedam listnih kriterija, čime je naznačeno da se svaka alternativa ocjenjuje prema svakom listnom kriteriju.</w:t>
       </w:r>
     </w:p>
     <w:p>
@@ -6546,7 +6583,7 @@
         <w:drawing>
           <wp:inline xmlns:a="http://schemas.openxmlformats.org/drawingml/2006/main" xmlns:pic="http://schemas.openxmlformats.org/drawingml/2006/picture">
             <wp:extent cx="5669280" cy="3583217"/>
-            <wp:docPr id="1" name="Picture 1"/>
+            <wp:docPr id="2" name="Picture 2"/>
             <wp:cNvGraphicFramePr>
               <a:graphicFrameLocks noChangeAspect="1"/>
             </wp:cNvGraphicFramePr>
@@ -6558,7 +6595,7 @@
                     <pic:cNvPicPr/>
                   </pic:nvPicPr>
                   <pic:blipFill>
-                    <a:blip r:embed="rId9"/>
+                    <a:blip r:embed="rId10"/>
                     <a:stretch>
                       <a:fillRect/>
                     </a:stretch>
@@ -6579,15 +6616,48 @@
     </w:p>
     <w:p>
       <w:pPr>
+        <w:pStyle w:val="Caption"/>
         <w:jc w:val="center"/>
       </w:pPr>
       <w:r>
         <w:rPr>
           <w:i/>
-          <w:color w:val="606060"/>
-          <w:sz w:val="16"/>
-        </w:rPr>
-        <w:t>Slika: 1_performance.png</w:t>
+          <w:color w:val="404040"/>
+          <w:sz w:val="18"/>
+        </w:rPr>
+        <w:t>Slika 2. Performance — lokalni prioriteti alternativa po kriterijima u odnosu na težine kriterija</w:t>
+      </w:r>
+    </w:p>
+    <w:p>
+      <w:r>
+        <w:rPr>
+          <w:b w:val="0"/>
+        </w:rPr>
+        <w:t xml:space="preserve">Na </w:t>
+      </w:r>
+      <w:r>
+        <w:rPr>
+          <w:b/>
+        </w:rPr>
+        <w:t>slici 2</w:t>
+      </w:r>
+      <w:r>
+        <w:rPr>
+          <w:b w:val="0"/>
+        </w:rPr>
+        <w:t xml:space="preserve"> prikazan je </w:t>
+      </w:r>
+      <w:r>
+        <w:rPr>
+          <w:i/>
+        </w:rPr>
+        <w:t>Performance</w:t>
+      </w:r>
+      <w:r>
+        <w:rPr>
+          <w:b w:val="0"/>
+        </w:rPr>
+        <w:t xml:space="preserve"> graf, koji za svaku alternativu prikazuje njezinu uspješnost po pojedinom kriteriju i istovremeno tu uspješnost povezuje s važnošću (težinom) tih kriterija.</w:t>
       </w:r>
     </w:p>
     <w:p>
@@ -6967,7 +7037,7 @@
         <w:rPr>
           <w:b w:val="0"/>
         </w:rPr>
-        <w:t>Dynamic analiza ispituje koliko je rješenje osjetljivo na promjene težina kriterija i od čega se sastoji. Prikazana je s tri grafa.</w:t>
+        <w:t>Dynamic analiza ispituje koliko je rješenje osjetljivo na promjene težina kriterija i od čega se sastoji. Prikazana je kroz tri slike (Slike 3, 4 i 5).</w:t>
       </w:r>
     </w:p>
     <w:p>
@@ -6986,7 +7056,7 @@
         <w:drawing>
           <wp:inline xmlns:a="http://schemas.openxmlformats.org/drawingml/2006/main" xmlns:pic="http://schemas.openxmlformats.org/drawingml/2006/picture">
             <wp:extent cx="5669280" cy="2604621"/>
-            <wp:docPr id="2" name="Picture 2"/>
+            <wp:docPr id="3" name="Picture 3"/>
             <wp:cNvGraphicFramePr>
               <a:graphicFrameLocks noChangeAspect="1"/>
             </wp:cNvGraphicFramePr>
@@ -6998,7 +7068,7 @@
                     <pic:cNvPicPr/>
                   </pic:nvPicPr>
                   <pic:blipFill>
-                    <a:blip r:embed="rId10"/>
+                    <a:blip r:embed="rId11"/>
                     <a:stretch>
                       <a:fillRect/>
                     </a:stretch>
@@ -7019,15 +7089,36 @@
     </w:p>
     <w:p>
       <w:pPr>
+        <w:pStyle w:val="Caption"/>
         <w:jc w:val="center"/>
       </w:pPr>
       <w:r>
         <w:rPr>
           <w:i/>
-          <w:color w:val="606060"/>
-          <w:sz w:val="16"/>
-        </w:rPr>
-        <w:t>Slika: 2_dynamic_base.png</w:t>
+          <w:color w:val="404040"/>
+          <w:sz w:val="18"/>
+        </w:rPr>
+        <w:t>Slika 3. Dynamic — trenutne težine kriterija (lijevo) i ukupni prioriteti alternativa (desno)</w:t>
+      </w:r>
+    </w:p>
+    <w:p>
+      <w:r>
+        <w:rPr>
+          <w:b w:val="0"/>
+        </w:rPr>
+        <w:t xml:space="preserve">Na </w:t>
+      </w:r>
+      <w:r>
+        <w:rPr>
+          <w:b/>
+        </w:rPr>
+        <w:t>slici 3</w:t>
+      </w:r>
+      <w:r>
+        <w:rPr>
+          <w:b w:val="0"/>
+        </w:rPr>
+        <w:t xml:space="preserve"> prikazano je trenutno („baseline") stanje modela — težine kriterija i iz njih proizašli ukupni prioriteti alternativa.</w:t>
       </w:r>
     </w:p>
     <w:p>
@@ -7142,196 +7233,6 @@
       </w:pPr>
       <w:r>
         <w:t>3.3.2. Scenariji ±10 %</w:t>
-      </w:r>
-    </w:p>
-    <w:p>
-      <w:pPr>
-        <w:jc w:val="center"/>
-      </w:pPr>
-      <w:r>
-        <w:drawing>
-          <wp:inline xmlns:a="http://schemas.openxmlformats.org/drawingml/2006/main" xmlns:pic="http://schemas.openxmlformats.org/drawingml/2006/picture">
-            <wp:extent cx="5669280" cy="3292676"/>
-            <wp:docPr id="3" name="Picture 3"/>
-            <wp:cNvGraphicFramePr>
-              <a:graphicFrameLocks noChangeAspect="1"/>
-            </wp:cNvGraphicFramePr>
-            <a:graphic>
-              <a:graphicData uri="http://schemas.openxmlformats.org/drawingml/2006/picture">
-                <pic:pic>
-                  <pic:nvPicPr>
-                    <pic:cNvPr id="0" name="2_dynamic_scenarios.png"/>
-                    <pic:cNvPicPr/>
-                  </pic:nvPicPr>
-                  <pic:blipFill>
-                    <a:blip r:embed="rId11"/>
-                    <a:stretch>
-                      <a:fillRect/>
-                    </a:stretch>
-                  </pic:blipFill>
-                  <pic:spPr>
-                    <a:xfrm>
-                      <a:off x="0" y="0"/>
-                      <a:ext cx="5669280" cy="3292676"/>
-                    </a:xfrm>
-                    <a:prstGeom prst="rect"/>
-                  </pic:spPr>
-                </pic:pic>
-              </a:graphicData>
-            </a:graphic>
-          </wp:inline>
-        </w:drawing>
-      </w:r>
-    </w:p>
-    <w:p>
-      <w:pPr>
-        <w:jc w:val="center"/>
-      </w:pPr>
-      <w:r>
-        <w:rPr>
-          <w:i/>
-          <w:color w:val="606060"/>
-          <w:sz w:val="16"/>
-        </w:rPr>
-        <w:t>Slika: 2_dynamic_scenarios.png</w:t>
-      </w:r>
-    </w:p>
-    <w:p>
-      <w:r>
-        <w:rPr>
-          <w:b/>
-        </w:rPr>
-        <w:t>Što se mjeri:</w:t>
-      </w:r>
-      <w:r>
-        <w:rPr>
-          <w:b w:val="0"/>
-        </w:rPr>
-        <w:t xml:space="preserve"> kako se ukupni prioriteti (okomita os „Ukupni prioritet") mijenjaju kad jednom kriteriju namjerno povećamo ili smanjimo težinu za 10 %, uz proporcionalnu preraspodjelu ostalih težina (da zbroj ostane 1,0).</w:t>
-      </w:r>
-    </w:p>
-    <w:p>
-      <w:r>
-        <w:rPr>
-          <w:b/>
-        </w:rPr>
-        <w:t>Elementi:</w:t>
-      </w:r>
-    </w:p>
-    <w:p>
-      <w:pPr>
-        <w:pStyle w:val="ListBullet"/>
-      </w:pPr>
-      <w:r>
-        <w:rPr>
-          <w:b w:val="0"/>
-        </w:rPr>
-        <w:t xml:space="preserve">Za svaku od šest alternativa (vodoravna os) prikazane su </w:t>
-      </w:r>
-      <w:r>
-        <w:rPr>
-          <w:b/>
-        </w:rPr>
-        <w:t>tri okomite stupca</w:t>
-      </w:r>
-      <w:r>
-        <w:rPr>
-          <w:b w:val="0"/>
-        </w:rPr>
-        <w:t xml:space="preserve"> čije značenje daje </w:t>
-      </w:r>
-      <w:r>
-        <w:rPr>
-          <w:b/>
-        </w:rPr>
-        <w:t>legenda u gornjem desnom kutu</w:t>
-      </w:r>
-      <w:r>
-        <w:rPr>
-          <w:b w:val="0"/>
-        </w:rPr>
-        <w:t xml:space="preserve">: </w:t>
-      </w:r>
-      <w:r>
-        <w:rPr>
-          <w:b/>
-        </w:rPr>
-        <w:t>sivi</w:t>
-      </w:r>
-      <w:r>
-        <w:rPr>
-          <w:b w:val="0"/>
-        </w:rPr>
-        <w:t xml:space="preserve"> = Baseline (polazno), </w:t>
-      </w:r>
-      <w:r>
-        <w:rPr>
-          <w:b/>
-        </w:rPr>
-        <w:t>plavi</w:t>
-      </w:r>
-      <w:r>
-        <w:rPr>
-          <w:b w:val="0"/>
-        </w:rPr>
-        <w:t xml:space="preserve"> = scenarij „Cijena −10 %", </w:t>
-      </w:r>
-      <w:r>
-        <w:rPr>
-          <w:b/>
-        </w:rPr>
-        <w:t>narančasti</w:t>
-      </w:r>
-      <w:r>
-        <w:rPr>
-          <w:b w:val="0"/>
-        </w:rPr>
-        <w:t xml:space="preserve"> = scenarij „Performanse +10 %". (Ova dva scenarija program je sam izdvojio kao najzanimljivija jer jedina izazivaju promjenu poretka.)</w:t>
-      </w:r>
-    </w:p>
-    <w:p>
-      <w:pPr>
-        <w:pStyle w:val="ListBullet"/>
-      </w:pPr>
-      <w:r>
-        <w:rPr>
-          <w:b w:val="0"/>
-        </w:rPr>
-        <w:t>Vodoravne crtkane linije su pomoćna mreža.</w:t>
-      </w:r>
-    </w:p>
-    <w:p>
-      <w:r>
-        <w:rPr>
-          <w:b/>
-        </w:rPr>
-        <w:t>Interpretacija:</w:t>
-      </w:r>
-      <w:r>
-        <w:rPr>
-          <w:b w:val="0"/>
-        </w:rPr>
-        <w:t xml:space="preserve"> za svaku alternativu sve tri stupca gotovo su jednake visine — promjene su sitne (reda 0,001–0,005). Honor ostaje nadmoćno najviši u sva tri slučaja (~0,30). Jedina posljedica: u oba scenarija OnePlus 11 (0,158) za dlaku prestigne Samsung A35 (0,156) i preuzme </w:t>
-      </w:r>
-      <w:r>
-        <w:rPr>
-          <w:b/>
-        </w:rPr>
-        <w:t>drugo mjesto</w:t>
-      </w:r>
-      <w:r>
-        <w:rPr>
-          <w:b w:val="0"/>
-        </w:rPr>
-        <w:t>, dok ostatak poretka ostaje netaknut. Zaključak: model je vrlo otporan — pomak težina od 10 % ne dira ni pobjednika ni opću strukturu, nego samo „prebacuje" dva ionako izjednačena kandidata za drugo mjesto.</w:t>
-      </w:r>
-    </w:p>
-    <w:p>
-      <w:pPr>
-        <w:pStyle w:val="Heading3"/>
-      </w:pPr>
-      <w:r>
-        <w:t>3.3.3. Components</w:t>
       </w:r>
     </w:p>
     <w:p>
@@ -7350,7 +7251,7 @@
               <a:graphicData uri="http://schemas.openxmlformats.org/drawingml/2006/picture">
                 <pic:pic>
                   <pic:nvPicPr>
-                    <pic:cNvPr id="0" name="2_dynamic_components.png"/>
+                    <pic:cNvPr id="0" name="2_dynamic_scenarios.png"/>
                     <pic:cNvPicPr/>
                   </pic:nvPicPr>
                   <pic:blipFill>
@@ -7375,41 +7276,36 @@
     </w:p>
     <w:p>
       <w:pPr>
+        <w:pStyle w:val="Caption"/>
         <w:jc w:val="center"/>
       </w:pPr>
       <w:r>
         <w:rPr>
           <w:i/>
-          <w:color w:val="606060"/>
-          <w:sz w:val="16"/>
-        </w:rPr>
-        <w:t>Slika: 2_dynamic_components.png</w:t>
+          <w:color w:val="404040"/>
+          <w:sz w:val="18"/>
+        </w:rPr>
+        <w:t>Slika 4. Dynamic — utjecaj promjene težine kriterija za ±10 % na ukupne prioritete alternativa</w:t>
       </w:r>
     </w:p>
     <w:p>
       <w:r>
         <w:rPr>
+          <w:b w:val="0"/>
+        </w:rPr>
+        <w:t xml:space="preserve">Na </w:t>
+      </w:r>
+      <w:r>
+        <w:rPr>
           <w:b/>
         </w:rPr>
-        <w:t>Što se mjeri:</w:t>
+        <w:t>slici 4</w:t>
       </w:r>
       <w:r>
         <w:rPr>
           <w:b w:val="0"/>
         </w:rPr>
-        <w:t xml:space="preserve"> od kojih se „sastojaka" sastoji ukupni prioritet svake alternative, tj. koliko svaki </w:t>
-      </w:r>
-      <w:r>
-        <w:rPr>
-          <w:i/>
-        </w:rPr>
-        <w:t>kriterij</w:t>
-      </w:r>
-      <w:r>
-        <w:rPr>
-          <w:b w:val="0"/>
-        </w:rPr>
-        <w:t xml:space="preserve"> doprinosi konačnom rezultatu te alternative. Okomita os je „Ukupni prioritet (po komponentama)".</w:t>
+        <w:t xml:space="preserve"> prikazan je utjecaj namjerne promjene težine pojedinog kriterija za ±10 % na ukupne prioritete alternativa.</w:t>
       </w:r>
     </w:p>
     <w:p>
@@ -7417,7 +7313,21 @@
         <w:rPr>
           <w:b/>
         </w:rPr>
-        <w:t>Elementi — pozor na boje:</w:t>
+        <w:t>Što se mjeri:</w:t>
+      </w:r>
+      <w:r>
+        <w:rPr>
+          <w:b w:val="0"/>
+        </w:rPr>
+        <w:t xml:space="preserve"> kako se ukupni prioriteti (okomita os „Ukupni prioritet") mijenjaju kad jednom kriteriju namjerno povećamo ili smanjimo težinu za 10 %, uz proporcionalnu preraspodjelu ostalih težina (da zbroj ostane 1,0).</w:t>
+      </w:r>
+    </w:p>
+    <w:p>
+      <w:r>
+        <w:rPr>
+          <w:b/>
+        </w:rPr>
+        <w:t>Elementi:</w:t>
       </w:r>
     </w:p>
     <w:p>
@@ -7428,19 +7338,67 @@
         <w:rPr>
           <w:b w:val="0"/>
         </w:rPr>
-        <w:t xml:space="preserve">Riječ je o </w:t>
+        <w:t xml:space="preserve">Za svaku od šest alternativa (vodoravna os) prikazane su </w:t>
       </w:r>
       <w:r>
         <w:rPr>
           <w:b/>
         </w:rPr>
-        <w:t>naslaganim (stacked) okomitim stupcima</w:t>
+        <w:t>tri okomite stupca</w:t>
       </w:r>
       <w:r>
         <w:rPr>
           <w:b w:val="0"/>
         </w:rPr>
-        <w:t>, jedan po alternativi.</w:t>
+        <w:t xml:space="preserve"> čije značenje daje </w:t>
+      </w:r>
+      <w:r>
+        <w:rPr>
+          <w:b/>
+        </w:rPr>
+        <w:t>legenda u gornjem desnom kutu</w:t>
+      </w:r>
+      <w:r>
+        <w:rPr>
+          <w:b w:val="0"/>
+        </w:rPr>
+        <w:t xml:space="preserve">: </w:t>
+      </w:r>
+      <w:r>
+        <w:rPr>
+          <w:b/>
+        </w:rPr>
+        <w:t>sivi</w:t>
+      </w:r>
+      <w:r>
+        <w:rPr>
+          <w:b w:val="0"/>
+        </w:rPr>
+        <w:t xml:space="preserve"> = Baseline (polazno), </w:t>
+      </w:r>
+      <w:r>
+        <w:rPr>
+          <w:b/>
+        </w:rPr>
+        <w:t>plavi</w:t>
+      </w:r>
+      <w:r>
+        <w:rPr>
+          <w:b w:val="0"/>
+        </w:rPr>
+        <w:t xml:space="preserve"> = scenarij „Cijena −10 %", </w:t>
+      </w:r>
+      <w:r>
+        <w:rPr>
+          <w:b/>
+        </w:rPr>
+        <w:t>narančasti</w:t>
+      </w:r>
+      <w:r>
+        <w:rPr>
+          <w:b w:val="0"/>
+        </w:rPr>
+        <w:t xml:space="preserve"> = scenarij „Performanse +10 %". (Ova dva scenarija program je sam izdvojio kao najzanimljivija jer jedina izazivaju promjenu poretka.)</w:t>
       </w:r>
     </w:p>
     <w:p>
@@ -7449,75 +7407,162 @@
       </w:pPr>
       <w:r>
         <w:rPr>
+          <w:b w:val="0"/>
+        </w:rPr>
+        <w:t>Vodoravne crtkane linije su pomoćna mreža.</w:t>
+      </w:r>
+    </w:p>
+    <w:p>
+      <w:r>
+        <w:rPr>
           <w:b/>
         </w:rPr>
-        <w:t>Boje segmenata ovdje označavaju KRITERIJE, a NE alternative</w:t>
+        <w:t>Interpretacija:</w:t>
       </w:r>
       <w:r>
         <w:rPr>
           <w:b w:val="0"/>
         </w:rPr>
-        <w:t xml:space="preserve"> (drukčija paleta nego na ostalim grafovima!). Prema legendi u gornjem desnom kutu: </w:t>
+        <w:t xml:space="preserve"> za svaku alternativu sve tri stupca gotovo su jednake visine — promjene su sitne (reda 0,001–0,005). Honor ostaje nadmoćno najviši u sva tri slučaja (~0,30). Jedina posljedica: u oba scenarija OnePlus 11 (0,158) za dlaku prestigne Samsung A35 (0,156) i preuzme </w:t>
       </w:r>
       <w:r>
         <w:rPr>
           <w:b/>
         </w:rPr>
-        <w:t>tirkizna = Cijena</w:t>
+        <w:t>drugo mjesto</w:t>
       </w:r>
       <w:r>
         <w:rPr>
           <w:b w:val="0"/>
         </w:rPr>
-        <w:t xml:space="preserve">, </w:t>
+        <w:t>, dok ostatak poretka ostaje netaknut. Zaključak: model je vrlo otporan — pomak težina od 10 % ne dira ni pobjednika ni opću strukturu, nego samo „prebacuje" dva ionako izjednačena kandidata za drugo mjesto.</w:t>
+      </w:r>
+    </w:p>
+    <w:p>
+      <w:pPr>
+        <w:pStyle w:val="Heading3"/>
+      </w:pPr>
+      <w:r>
+        <w:t>3.3.3. Components</w:t>
+      </w:r>
+    </w:p>
+    <w:p>
+      <w:pPr>
+        <w:jc w:val="center"/>
+      </w:pPr>
+      <w:r>
+        <w:drawing>
+          <wp:inline xmlns:a="http://schemas.openxmlformats.org/drawingml/2006/main" xmlns:pic="http://schemas.openxmlformats.org/drawingml/2006/picture">
+            <wp:extent cx="5669280" cy="3292676"/>
+            <wp:docPr id="5" name="Picture 5"/>
+            <wp:cNvGraphicFramePr>
+              <a:graphicFrameLocks noChangeAspect="1"/>
+            </wp:cNvGraphicFramePr>
+            <a:graphic>
+              <a:graphicData uri="http://schemas.openxmlformats.org/drawingml/2006/picture">
+                <pic:pic>
+                  <pic:nvPicPr>
+                    <pic:cNvPr id="0" name="2_dynamic_components.png"/>
+                    <pic:cNvPicPr/>
+                  </pic:nvPicPr>
+                  <pic:blipFill>
+                    <a:blip r:embed="rId13"/>
+                    <a:stretch>
+                      <a:fillRect/>
+                    </a:stretch>
+                  </pic:blipFill>
+                  <pic:spPr>
+                    <a:xfrm>
+                      <a:off x="0" y="0"/>
+                      <a:ext cx="5669280" cy="3292676"/>
+                    </a:xfrm>
+                    <a:prstGeom prst="rect"/>
+                  </pic:spPr>
+                </pic:pic>
+              </a:graphicData>
+            </a:graphic>
+          </wp:inline>
+        </w:drawing>
+      </w:r>
+    </w:p>
+    <w:p>
+      <w:pPr>
+        <w:pStyle w:val="Caption"/>
+        <w:jc w:val="center"/>
+      </w:pPr>
+      <w:r>
+        <w:rPr>
+          <w:i/>
+          <w:color w:val="404040"/>
+          <w:sz w:val="18"/>
+        </w:rPr>
+        <w:t>Slika 5. Dynamic / Components — doprinos pojedinih kriterija ukupnom prioritetu svake alternative</w:t>
+      </w:r>
+    </w:p>
+    <w:p>
+      <w:r>
+        <w:rPr>
+          <w:b w:val="0"/>
+        </w:rPr>
+        <w:t xml:space="preserve">Na </w:t>
       </w:r>
       <w:r>
         <w:rPr>
           <w:b/>
         </w:rPr>
-        <w:t>crveno-narančasta (losos) = Kvaliteta kamere</w:t>
+        <w:t>slici 5</w:t>
       </w:r>
       <w:r>
         <w:rPr>
           <w:b w:val="0"/>
         </w:rPr>
-        <w:t xml:space="preserve">, </w:t>
-      </w:r>
+        <w:t xml:space="preserve"> prikazana je </w:t>
+      </w:r>
+      <w:r>
+        <w:rPr>
+          <w:i/>
+        </w:rPr>
+        <w:t>Components</w:t>
+      </w:r>
+      <w:r>
+        <w:rPr>
+          <w:b w:val="0"/>
+        </w:rPr>
+        <w:t xml:space="preserve"> razdioba — od kojih se „sastojaka" (doprinosa pojedinih kriterija) sastoji ukupni prioritet svake alternative.</w:t>
+      </w:r>
+    </w:p>
+    <w:p>
       <w:r>
         <w:rPr>
           <w:b/>
         </w:rPr>
-        <w:t>zeleno-limeta = Performanse</w:t>
+        <w:t>Što se mjeri:</w:t>
       </w:r>
       <w:r>
         <w:rPr>
           <w:b w:val="0"/>
         </w:rPr>
-        <w:t xml:space="preserve">, </w:t>
-      </w:r>
+        <w:t xml:space="preserve"> od kojih se „sastojaka" sastoji ukupni prioritet svake alternative, tj. koliko svaki </w:t>
+      </w:r>
+      <w:r>
+        <w:rPr>
+          <w:i/>
+        </w:rPr>
+        <w:t>kriterij</w:t>
+      </w:r>
+      <w:r>
+        <w:rPr>
+          <w:b w:val="0"/>
+        </w:rPr>
+        <w:t xml:space="preserve"> doprinosi konačnom rezultatu te alternative. Okomita os je „Ukupni prioritet (po komponentama)".</w:t>
+      </w:r>
+    </w:p>
+    <w:p>
       <w:r>
         <w:rPr>
           <w:b/>
         </w:rPr>
-        <w:t>ljubičasta = Fizičke karakteristike</w:t>
-      </w:r>
-      <w:r>
-        <w:rPr>
-          <w:b w:val="0"/>
-        </w:rPr>
-        <w:t xml:space="preserve">, </w:t>
-      </w:r>
-      <w:r>
-        <w:rPr>
-          <w:b/>
-        </w:rPr>
-        <w:t>žuta = Pohrana podataka</w:t>
-      </w:r>
-      <w:r>
-        <w:rPr>
-          <w:b w:val="0"/>
-        </w:rPr>
-        <w:t>.</w:t>
+        <w:t>Elementi — pozor na boje:</w:t>
       </w:r>
     </w:p>
     <w:p>
@@ -7528,6 +7573,106 @@
         <w:rPr>
           <w:b w:val="0"/>
         </w:rPr>
+        <w:t xml:space="preserve">Riječ je o </w:t>
+      </w:r>
+      <w:r>
+        <w:rPr>
+          <w:b/>
+        </w:rPr>
+        <w:t>naslaganim (stacked) okomitim stupcima</w:t>
+      </w:r>
+      <w:r>
+        <w:rPr>
+          <w:b w:val="0"/>
+        </w:rPr>
+        <w:t>, jedan po alternativi.</w:t>
+      </w:r>
+    </w:p>
+    <w:p>
+      <w:pPr>
+        <w:pStyle w:val="ListBullet"/>
+      </w:pPr>
+      <w:r>
+        <w:rPr>
+          <w:b/>
+        </w:rPr>
+        <w:t>Boje segmenata ovdje označavaju KRITERIJE, a NE alternative</w:t>
+      </w:r>
+      <w:r>
+        <w:rPr>
+          <w:b w:val="0"/>
+        </w:rPr>
+        <w:t xml:space="preserve"> (drukčija paleta nego na ostalim grafovima!). Prema legendi u gornjem desnom kutu: </w:t>
+      </w:r>
+      <w:r>
+        <w:rPr>
+          <w:b/>
+        </w:rPr>
+        <w:t>tirkizna = Cijena</w:t>
+      </w:r>
+      <w:r>
+        <w:rPr>
+          <w:b w:val="0"/>
+        </w:rPr>
+        <w:t xml:space="preserve">, </w:t>
+      </w:r>
+      <w:r>
+        <w:rPr>
+          <w:b/>
+        </w:rPr>
+        <w:t>crveno-narančasta (losos) = Kvaliteta kamere</w:t>
+      </w:r>
+      <w:r>
+        <w:rPr>
+          <w:b w:val="0"/>
+        </w:rPr>
+        <w:t xml:space="preserve">, </w:t>
+      </w:r>
+      <w:r>
+        <w:rPr>
+          <w:b/>
+        </w:rPr>
+        <w:t>zeleno-limeta = Performanse</w:t>
+      </w:r>
+      <w:r>
+        <w:rPr>
+          <w:b w:val="0"/>
+        </w:rPr>
+        <w:t xml:space="preserve">, </w:t>
+      </w:r>
+      <w:r>
+        <w:rPr>
+          <w:b/>
+        </w:rPr>
+        <w:t>ljubičasta = Fizičke karakteristike</w:t>
+      </w:r>
+      <w:r>
+        <w:rPr>
+          <w:b w:val="0"/>
+        </w:rPr>
+        <w:t xml:space="preserve">, </w:t>
+      </w:r>
+      <w:r>
+        <w:rPr>
+          <w:b/>
+        </w:rPr>
+        <w:t>žuta = Pohrana podataka</w:t>
+      </w:r>
+      <w:r>
+        <w:rPr>
+          <w:b w:val="0"/>
+        </w:rPr>
+        <w:t>.</w:t>
+      </w:r>
+    </w:p>
+    <w:p>
+      <w:pPr>
+        <w:pStyle w:val="ListBullet"/>
+      </w:pPr>
+      <w:r>
+        <w:rPr>
+          <w:b w:val="0"/>
+        </w:rPr>
         <w:t>Visina pojedinog segmenta = doprinos tog kriterija; ukupna visina stupca = ukupni prioritet alternative (pa je Honorov stupac najviši, 0,302).</w:t>
       </w:r>
     </w:p>
@@ -7609,7 +7754,7 @@
         <w:drawing>
           <wp:inline xmlns:a="http://schemas.openxmlformats.org/drawingml/2006/main" xmlns:pic="http://schemas.openxmlformats.org/drawingml/2006/picture">
             <wp:extent cx="5669280" cy="3161186"/>
-            <wp:docPr id="5" name="Picture 5"/>
+            <wp:docPr id="6" name="Picture 6"/>
             <wp:cNvGraphicFramePr>
               <a:graphicFrameLocks noChangeAspect="1"/>
             </wp:cNvGraphicFramePr>
@@ -7621,7 +7766,7 @@
                     <pic:cNvPicPr/>
                   </pic:nvPicPr>
                   <pic:blipFill>
-                    <a:blip r:embed="rId13"/>
+                    <a:blip r:embed="rId14"/>
                     <a:stretch>
                       <a:fillRect/>
                     </a:stretch>
@@ -7642,15 +7787,48 @@
     </w:p>
     <w:p>
       <w:pPr>
+        <w:pStyle w:val="Caption"/>
         <w:jc w:val="center"/>
       </w:pPr>
       <w:r>
         <w:rPr>
           <w:i/>
-          <w:color w:val="606060"/>
-          <w:sz w:val="16"/>
-        </w:rPr>
-        <w:t>Slika: 3_gradient.png</w:t>
+          <w:color w:val="404040"/>
+          <w:sz w:val="18"/>
+        </w:rPr>
+        <w:t>Slika 6. Gradient — promjena prioriteta alternativa s promjenom težine pojedinog kriterija</w:t>
+      </w:r>
+    </w:p>
+    <w:p>
+      <w:r>
+        <w:rPr>
+          <w:b w:val="0"/>
+        </w:rPr>
+        <w:t xml:space="preserve">Na </w:t>
+      </w:r>
+      <w:r>
+        <w:rPr>
+          <w:b/>
+        </w:rPr>
+        <w:t>slici 6</w:t>
+      </w:r>
+      <w:r>
+        <w:rPr>
+          <w:b w:val="0"/>
+        </w:rPr>
+        <w:t xml:space="preserve"> prikazana je </w:t>
+      </w:r>
+      <w:r>
+        <w:rPr>
+          <w:i/>
+        </w:rPr>
+        <w:t>Gradient</w:t>
+      </w:r>
+      <w:r>
+        <w:rPr>
+          <w:b w:val="0"/>
+        </w:rPr>
+        <w:t xml:space="preserve"> analiza, koja za svaki kriterij zasebno pokazuje kako njegova težina utječe na prioritete (i poredak) alternativa.</w:t>
       </w:r>
     </w:p>
     <w:p>
@@ -7945,7 +8123,7 @@
         <w:drawing>
           <wp:inline xmlns:a="http://schemas.openxmlformats.org/drawingml/2006/main" xmlns:pic="http://schemas.openxmlformats.org/drawingml/2006/picture">
             <wp:extent cx="5669280" cy="3378826"/>
-            <wp:docPr id="6" name="Picture 6"/>
+            <wp:docPr id="7" name="Picture 7"/>
             <wp:cNvGraphicFramePr>
               <a:graphicFrameLocks noChangeAspect="1"/>
             </wp:cNvGraphicFramePr>
@@ -7957,7 +8135,7 @@
                     <pic:cNvPicPr/>
                   </pic:nvPicPr>
                   <pic:blipFill>
-                    <a:blip r:embed="rId14"/>
+                    <a:blip r:embed="rId15"/>
                     <a:stretch>
                       <a:fillRect/>
                     </a:stretch>
@@ -7978,15 +8156,48 @@
     </w:p>
     <w:p>
       <w:pPr>
+        <w:pStyle w:val="Caption"/>
         <w:jc w:val="center"/>
       </w:pPr>
       <w:r>
         <w:rPr>
           <w:i/>
-          <w:color w:val="606060"/>
-          <w:sz w:val="16"/>
-        </w:rPr>
-        <w:t>Slika: 4_head_to_head.png</w:t>
+          <w:color w:val="404040"/>
+          <w:sz w:val="18"/>
+        </w:rPr>
+        <w:t>Slika 7. Head-to-head — usporedba dviju najboljih alternativa po svim listnim kriterijima</w:t>
+      </w:r>
+    </w:p>
+    <w:p>
+      <w:r>
+        <w:rPr>
+          <w:b w:val="0"/>
+        </w:rPr>
+        <w:t xml:space="preserve">Na </w:t>
+      </w:r>
+      <w:r>
+        <w:rPr>
+          <w:b/>
+        </w:rPr>
+        <w:t>slici 7</w:t>
+      </w:r>
+      <w:r>
+        <w:rPr>
+          <w:b w:val="0"/>
+        </w:rPr>
+        <w:t xml:space="preserve"> prikazana je </w:t>
+      </w:r>
+      <w:r>
+        <w:rPr>
+          <w:i/>
+        </w:rPr>
+        <w:t>Head-to-head</w:t>
+      </w:r>
+      <w:r>
+        <w:rPr>
+          <w:b w:val="0"/>
+        </w:rPr>
+        <w:t xml:space="preserve"> analiza — izravna usporedba dviju najboljih alternativa (Honor 90 i Samsung Galaxy A35) po svim listnim kriterijima.</w:t>
       </w:r>
     </w:p>
     <w:p>
@@ -8303,7 +8514,7 @@
         <w:drawing>
           <wp:inline xmlns:a="http://schemas.openxmlformats.org/drawingml/2006/main" xmlns:pic="http://schemas.openxmlformats.org/drawingml/2006/picture">
             <wp:extent cx="5669280" cy="5252107"/>
-            <wp:docPr id="7" name="Picture 7"/>
+            <wp:docPr id="8" name="Picture 8"/>
             <wp:cNvGraphicFramePr>
               <a:graphicFrameLocks noChangeAspect="1"/>
             </wp:cNvGraphicFramePr>
@@ -8315,7 +8526,7 @@
                     <pic:cNvPicPr/>
                   </pic:nvPicPr>
                   <pic:blipFill>
-                    <a:blip r:embed="rId15"/>
+                    <a:blip r:embed="rId16"/>
                     <a:stretch>
                       <a:fillRect/>
                     </a:stretch>
@@ -8336,15 +8547,48 @@
     </w:p>
     <w:p>
       <w:pPr>
+        <w:pStyle w:val="Caption"/>
         <w:jc w:val="center"/>
       </w:pPr>
       <w:r>
         <w:rPr>
           <w:i/>
-          <w:color w:val="606060"/>
-          <w:sz w:val="16"/>
-        </w:rPr>
-        <w:t>Slika: 5_two_d.png</w:t>
+          <w:color w:val="404040"/>
+          <w:sz w:val="18"/>
+        </w:rPr>
+        <w:t>Slika 8. 2D — položaj alternativa s obzirom na dva najvažnija kriterija (kvaliteta kamere i performanse)</w:t>
+      </w:r>
+    </w:p>
+    <w:p>
+      <w:r>
+        <w:rPr>
+          <w:b w:val="0"/>
+        </w:rPr>
+        <w:t xml:space="preserve">Na </w:t>
+      </w:r>
+      <w:r>
+        <w:rPr>
+          <w:b/>
+        </w:rPr>
+        <w:t>slici 8</w:t>
+      </w:r>
+      <w:r>
+        <w:rPr>
+          <w:b w:val="0"/>
+        </w:rPr>
+        <w:t xml:space="preserve"> prikazan je </w:t>
+      </w:r>
+      <w:r>
+        <w:rPr>
+          <w:i/>
+        </w:rPr>
+        <w:t>2D</w:t>
+      </w:r>
+      <w:r>
+        <w:rPr>
+          <w:b w:val="0"/>
+        </w:rPr>
+        <w:t xml:space="preserve"> graf koji smješta alternative u koordinatni sustav definiran dvama najvažnijim kriterijima (kvaliteta kamere i performanse).</w:t>
       </w:r>
     </w:p>
     <w:p>
@@ -8721,7 +8965,7 @@
         <w:rPr>
           <w:b w:val="0"/>
         </w:rPr>
-        <w:t xml:space="preserve"> dosljedno se vidi na Components, Performance, Head-to-head i 2D grafu: Honorova prednost gotovo isključivo dolazi iz </w:t>
+        <w:t xml:space="preserve"> dosljedno se vidi na Components (Slika 5), Performance (Slika 2), Head-to-head (Slika 7) i 2D grafu (Slika 8): Honorova prednost gotovo isključivo dolazi iz </w:t>
       </w:r>
       <w:r>
         <w:rPr>

</xml_diff>

<commit_message>
Dodaj numerirane titlove za sve tablice (Tablica 1-13) u .md i .docx
Co-Authored-By: Claude Opus 4.8 <noreply@anthropic.com>
</commit_message>
<xml_diff>
--- a/Seminar_AHP_Odabir_mobitela.docx
+++ b/Seminar_AHP_Odabir_mobitela.docx
@@ -679,6 +679,17 @@
           <w:b w:val="0"/>
         </w:rPr>
         <w:t xml:space="preserve"> — aktualnih uređaja iz različitih cjenovnih i funkcionalnih razreda. Sve vrijednosti prikupljene su s navedenih maloprodajnih izvora:</w:t>
+      </w:r>
+    </w:p>
+    <w:p>
+      <w:pPr>
+        <w:pStyle w:val="Caption"/>
+      </w:pPr>
+      <w:r>
+        <w:rPr>
+          <w:b w:val="0"/>
+        </w:rPr>
+        <w:t>Tablica 1. Sumarne vrijednosti kriterija za šest alternativa</w:t>
       </w:r>
     </w:p>
     <w:tbl>
@@ -1834,6 +1845,17 @@
         <w:t>. Korištena je Saatyjeva ljestvica:</w:t>
       </w:r>
     </w:p>
+    <w:p>
+      <w:pPr>
+        <w:pStyle w:val="Caption"/>
+      </w:pPr>
+      <w:r>
+        <w:rPr>
+          <w:b w:val="0"/>
+        </w:rPr>
+        <w:t>Tablica 2. Saatyjeva ljestvica za usporedbu elemenata u parovima</w:t>
+      </w:r>
+    </w:p>
     <w:tbl>
       <w:tblPr>
         <w:tblStyle w:val="LightGrid-Accent1"/>
@@ -2084,6 +2106,17 @@
           <w:b w:val="0"/>
         </w:rPr>
         <w:t>Polazeći od Ivaninih potreba (kamera je najvažnija, slijede performanse, zatim pohrana i cijena, a fizičke su karakteristike najmanje važne), dobivena je sljedeća matrica usporedbi u parovima:</w:t>
+      </w:r>
+    </w:p>
+    <w:p>
+      <w:pPr>
+        <w:pStyle w:val="Caption"/>
+      </w:pPr>
+      <w:r>
+        <w:rPr>
+          <w:b w:val="0"/>
+        </w:rPr>
+        <w:t>Tablica 3. Matrica usporedbi kriterija s obzirom na cilj</w:t>
       </w:r>
     </w:p>
     <w:tbl>
@@ -2595,6 +2628,17 @@
         <w:t>:</w:t>
       </w:r>
     </w:p>
+    <w:p>
+      <w:pPr>
+        <w:pStyle w:val="Caption"/>
+      </w:pPr>
+      <w:r>
+        <w:rPr>
+          <w:b w:val="0"/>
+        </w:rPr>
+        <w:t>Tablica 4. Težinski koeficijenti (lokalni prioriteti) kriterija</w:t>
+      </w:r>
+    </w:p>
     <w:tbl>
       <w:tblPr>
         <w:tblStyle w:val="LightGrid-Accent1"/>
@@ -2815,6 +2859,17 @@
           <w:b w:val="0"/>
         </w:rPr>
         <w:t xml:space="preserve"> (RAM nasuprot Bateriji): RAM je za Ivanin multitasking i obradu ocijenjen umjereno važnijim od baterije (ocjena 2).</w:t>
+      </w:r>
+    </w:p>
+    <w:p>
+      <w:pPr>
+        <w:pStyle w:val="Caption"/>
+      </w:pPr>
+      <w:r>
+        <w:rPr>
+          <w:b w:val="0"/>
+        </w:rPr>
+        <w:t>Tablica 5. Matrica usporedbi podkriterija kriterija Performanse</w:t>
       </w:r>
     </w:p>
     <w:tbl>
@@ -2999,6 +3054,17 @@
         <w:t xml:space="preserve"> (Ekran nasuprot Težini): veličina ekrana, važna za pregled radova, ocijenjena je umjereno do jako važnijom od težine (ocjena 3).</w:t>
       </w:r>
     </w:p>
+    <w:p>
+      <w:pPr>
+        <w:pStyle w:val="Caption"/>
+      </w:pPr>
+      <w:r>
+        <w:rPr>
+          <w:b w:val="0"/>
+        </w:rPr>
+        <w:t>Tablica 6. Matrica usporedbi podkriterija kriterija Fizičke karakteristike</w:t>
+      </w:r>
+    </w:p>
     <w:tbl>
       <w:tblPr>
         <w:tblStyle w:val="LightGrid-Accent1"/>
@@ -3257,6 +3323,17 @@
           <w:b w:val="0"/>
         </w:rPr>
         <w:t>:</w:t>
+      </w:r>
+    </w:p>
+    <w:p>
+      <w:pPr>
+        <w:pStyle w:val="Caption"/>
+      </w:pPr>
+      <w:r>
+        <w:rPr>
+          <w:b w:val="0"/>
+        </w:rPr>
+        <w:t>Tablica 7. Lokalni prioriteti alternativa po listnim kriterijima (Data mode)</w:t>
       </w:r>
     </w:p>
     <w:tbl>
@@ -4069,6 +4146,17 @@
         <w:t xml:space="preserve"> (umnožak težina po putu od cilja do lista):</w:t>
       </w:r>
     </w:p>
+    <w:p>
+      <w:pPr>
+        <w:pStyle w:val="Caption"/>
+      </w:pPr>
+      <w:r>
+        <w:rPr>
+          <w:b w:val="0"/>
+        </w:rPr>
+        <w:t>Tablica 8. Globalne težine listnih kriterija</w:t>
+      </w:r>
+    </w:p>
     <w:tbl>
       <w:tblPr>
         <w:tblStyle w:val="LightGrid-Accent1"/>
@@ -4487,6 +4575,17 @@
           <w:b w:val="0"/>
         </w:rPr>
         <w:t xml:space="preserve"> (normalizacija po najboljoj alternativi, otpornija na pojavu obrtanja ranga):</w:t>
+      </w:r>
+    </w:p>
+    <w:p>
+      <w:pPr>
+        <w:pStyle w:val="Caption"/>
+      </w:pPr>
+      <w:r>
+        <w:rPr>
+          <w:b w:val="0"/>
+        </w:rPr>
+        <w:t>Tablica 9. Konačni poredak alternativa (Distributive i Ideal sinteza)</w:t>
       </w:r>
     </w:p>
     <w:tbl>
@@ -5143,6 +5242,17 @@
         <w:t>Stalna shema boja alternativa (vrijedi na svim grafovima osim Components):</w:t>
       </w:r>
     </w:p>
+    <w:p>
+      <w:pPr>
+        <w:pStyle w:val="Caption"/>
+      </w:pPr>
+      <w:r>
+        <w:rPr>
+          <w:b w:val="0"/>
+        </w:rPr>
+        <w:t>Tablica 10. Shema boja alternativa i njihove ključne sirove vrijednosti</w:t>
+      </w:r>
+    </w:p>
     <w:tbl>
       <w:tblPr>
         <w:tblStyle w:val="LightGrid-Accent1"/>
@@ -5457,6 +5567,17 @@
           <w:b w:val="0"/>
         </w:rPr>
         <w:t>Usporedbom kriterija s obzirom na cilj dobivene su globalne težine (zbroj = 1,0):</w:t>
+      </w:r>
+    </w:p>
+    <w:p>
+      <w:pPr>
+        <w:pStyle w:val="Caption"/>
+      </w:pPr>
+      <w:r>
+        <w:rPr>
+          <w:b w:val="0"/>
+        </w:rPr>
+        <w:t>Tablica 11. Težine glavnih kriterija s pripadajućim podkriterijima</w:t>
       </w:r>
     </w:p>
     <w:tbl>
@@ -5817,6 +5938,17 @@
         <w:t>, tj. konačni „utezi" svake mjerljive značajke:</w:t>
       </w:r>
     </w:p>
+    <w:p>
+      <w:pPr>
+        <w:pStyle w:val="Caption"/>
+      </w:pPr>
+      <w:r>
+        <w:rPr>
+          <w:b w:val="0"/>
+        </w:rPr>
+        <w:t>Tablica 12. Globalne težine listnih kriterija</w:t>
+      </w:r>
+    </w:p>
     <w:tbl>
       <w:tblPr>
         <w:tblStyle w:val="LightGrid-Accent1"/>
@@ -6153,6 +6285,17 @@
           <w:b w:val="0"/>
         </w:rPr>
         <w:t xml:space="preserve"> (sinteza po oba načina koje nudi Expert Choice):</w:t>
+      </w:r>
+    </w:p>
+    <w:p>
+      <w:pPr>
+        <w:pStyle w:val="Caption"/>
+      </w:pPr>
+      <w:r>
+        <w:rPr>
+          <w:b w:val="0"/>
+        </w:rPr>
+        <w:t>Tablica 13. Konačni poredak alternativa u oba načina sinteze</w:t>
       </w:r>
     </w:p>
     <w:tbl>

</xml_diff>